<commit_message>
agregando una explicación de la lógica del sistema y su uml
</commit_message>
<xml_diff>
--- a/Refactoring Sistema Comfychair.docx
+++ b/Refactoring Sistema Comfychair.docx
@@ -1,17 +1,23 @@
 
 <file path=word/document.xml><?xml version="1.0" encoding="utf-8"?>
-<w:document xmlns:wpc="http://schemas.microsoft.com/office/word/2010/wordprocessingCanvas" xmlns:cx="http://schemas.microsoft.com/office/drawing/2014/chartex" xmlns:cx1="http://schemas.microsoft.com/office/drawing/2015/9/8/chartex" xmlns:cx2="http://schemas.microsoft.com/office/drawing/2015/10/21/chartex" xmlns:cx3="http://schemas.microsoft.com/office/drawing/2016/5/9/chartex" xmlns:cx4="http://schemas.microsoft.com/office/drawing/2016/5/10/chartex" xmlns:cx5="http://schemas.microsoft.com/office/drawing/2016/5/11/chartex" xmlns:cx6="http://schemas.microsoft.com/office/drawing/2016/5/12/chartex" xmlns:cx7="http://schemas.microsoft.com/office/drawing/2016/5/13/chartex" xmlns:cx8="http://schemas.microsoft.com/office/drawing/2016/5/14/chartex" xmlns:mc="http://schemas.openxmlformats.org/markup-compatibility/2006" xmlns:aink="http://schemas.microsoft.com/office/drawing/2016/ink" xmlns:am3d="http://schemas.microsoft.com/office/drawing/2017/model3d" xmlns:o="urn:schemas-microsoft-com:office:office" xmlns:oel="http://schemas.microsoft.com/office/2019/extlst" xmlns:r="http://schemas.openxmlformats.org/officeDocument/2006/relationships" xmlns:m="http://schemas.openxmlformats.org/officeDocument/2006/math" xmlns:v="urn:schemas-microsoft-com:vml" xmlns:wp14="http://schemas.microsoft.com/office/word/2010/wordprocessingDrawing" xmlns:wp="http://schemas.openxmlformats.org/drawingml/2006/wordprocessingDrawing" xmlns:w10="urn:schemas-microsoft-com:office:word" xmlns:w="http://schemas.openxmlformats.org/wordprocessingml/2006/main" xmlns:w14="http://schemas.microsoft.com/office/word/2010/wordml" xmlns:w15="http://schemas.microsoft.com/office/word/2012/wordml" xmlns:w16cex="http://schemas.microsoft.com/office/word/2018/wordml/cex" xmlns:w16cid="http://schemas.microsoft.com/office/word/2016/wordml/cid" xmlns:w16="http://schemas.microsoft.com/office/word/2018/wordml" xmlns:w16du="http://schemas.microsoft.com/office/word/2023/wordml/word16du" xmlns:w16sdtdh="http://schemas.microsoft.com/office/word/2020/wordml/sdtdatahash" xmlns:w16sdtfl="http://schemas.microsoft.com/office/word/2024/wordml/sdtformatlock" xmlns:w16se="http://schemas.microsoft.com/office/word/2015/wordml/symex" xmlns:wpg="http://schemas.microsoft.com/office/word/2010/wordprocessingGroup" xmlns:wpi="http://schemas.microsoft.com/office/word/2010/wordprocessingInk" xmlns:wne="http://schemas.microsoft.com/office/word/2006/wordml" xmlns:wps="http://schemas.microsoft.com/office/word/2010/wordprocessingShape" mc:Ignorable="w14 w15 w16se w16cid w16 w16cex w16sdtdh w16sdtfl w16du wp14">
+<w:document xmlns:wpc="http://schemas.microsoft.com/office/word/2010/wordprocessingCanvas" xmlns:cx="http://schemas.microsoft.com/office/drawing/2014/chartex" xmlns:mc="http://schemas.openxmlformats.org/markup-compatibility/2006" xmlns:o="urn:schemas-microsoft-com:office:office" xmlns:r="http://schemas.openxmlformats.org/officeDocument/2006/relationships" xmlns:m="http://schemas.openxmlformats.org/officeDocument/2006/math" xmlns:v="urn:schemas-microsoft-com:vml" xmlns:wp14="http://schemas.microsoft.com/office/word/2010/wordprocessingDrawing" xmlns:wp="http://schemas.openxmlformats.org/drawingml/2006/wordprocessingDrawing" xmlns:w10="urn:schemas-microsoft-com:office:word" xmlns:w="http://schemas.openxmlformats.org/wordprocessingml/2006/main" xmlns:w14="http://schemas.microsoft.com/office/word/2010/wordml" xmlns:w15="http://schemas.microsoft.com/office/word/2012/wordml" xmlns:w16se="http://schemas.microsoft.com/office/word/2015/wordml/symex" xmlns:wpg="http://schemas.microsoft.com/office/word/2010/wordprocessingGroup" xmlns:wpi="http://schemas.microsoft.com/office/word/2010/wordprocessingInk" xmlns:wne="http://schemas.microsoft.com/office/word/2006/wordml" xmlns:wps="http://schemas.microsoft.com/office/word/2010/wordprocessingShape" mc:Ignorable="w14 w15 w16se wp14">
   <w:body>
     <w:p>
       <w:pPr>
         <w:jc w:val="center"/>
         <w:rPr>
-          <w:lang w:val="es-AR"/>
-        </w:rPr>
-      </w:pPr>
-      <w:proofErr w:type="spellStart"/>
-      <w:r>
-        <w:rPr>
+          <w:b/>
+          <w:sz w:val="28"/>
+          <w:szCs w:val="28"/>
+          <w:lang w:val="es-AR"/>
+        </w:rPr>
+      </w:pPr>
+      <w:proofErr w:type="spellStart"/>
+      <w:r>
+        <w:rPr>
+          <w:b/>
+          <w:sz w:val="28"/>
+          <w:szCs w:val="28"/>
           <w:lang w:val="es-AR"/>
         </w:rPr>
         <w:t>Refactoring</w:t>
@@ -19,6 +25,9 @@
       <w:proofErr w:type="spellEnd"/>
       <w:r>
         <w:rPr>
+          <w:b/>
+          <w:sz w:val="28"/>
+          <w:szCs w:val="28"/>
           <w:lang w:val="es-AR"/>
         </w:rPr>
         <w:t xml:space="preserve"> Sistema </w:t>
@@ -26,6 +35,9 @@
       <w:proofErr w:type="spellStart"/>
       <w:r>
         <w:rPr>
+          <w:b/>
+          <w:sz w:val="28"/>
+          <w:szCs w:val="28"/>
           <w:lang w:val="es-AR"/>
         </w:rPr>
         <w:t>Comfychair</w:t>
@@ -34,16 +46,65 @@
     </w:p>
     <w:p>
       <w:pPr>
-        <w:rPr>
-          <w:lang w:val="es-AR"/>
-        </w:rPr>
-      </w:pPr>
-      <w:r>
-        <w:rPr>
-          <w:lang w:val="es-AR"/>
-        </w:rPr>
-        <w:t xml:space="preserve">El objeto </w:t>
-      </w:r>
+        <w:spacing w:line="276" w:lineRule="auto"/>
+        <w:jc w:val="both"/>
+        <w:rPr>
+          <w:lang w:val="es-AR"/>
+        </w:rPr>
+      </w:pPr>
+      <w:r>
+        <w:rPr>
+          <w:lang w:val="es-AR"/>
+        </w:rPr>
+        <w:t xml:space="preserve">El sistema modelado representa la gestión de conferencias académicas, permitiendo la creación de conferencias, la administración de sesiones, la revisión de artículos, la puntuación de los artículos aceptados y la selección de los mejores artículos adoptando </w:t>
+      </w:r>
+      <w:r>
+        <w:rPr>
+          <w:lang w:val="es-AR"/>
+        </w:rPr>
+        <w:t>estrategias</w:t>
+      </w:r>
+      <w:r>
+        <w:rPr>
+          <w:lang w:val="es-AR"/>
+        </w:rPr>
+        <w:t xml:space="preserve"> de selección</w:t>
+      </w:r>
+      <w:r>
+        <w:rPr>
+          <w:lang w:val="es-AR"/>
+        </w:rPr>
+        <w:t>. El diseño sigue un enfoque orientado a objetos con una jerarquía bien definida.</w:t>
+      </w:r>
+    </w:p>
+    <w:p>
+      <w:pPr>
+        <w:rPr>
+          <w:u w:val="single"/>
+          <w:lang w:val="es-AR"/>
+        </w:rPr>
+      </w:pPr>
+      <w:r>
+        <w:rPr>
+          <w:u w:val="single"/>
+          <w:lang w:val="es-AR"/>
+        </w:rPr>
+        <w:t>Clases principales</w:t>
+      </w:r>
+    </w:p>
+    <w:p>
+      <w:pPr>
+        <w:pStyle w:val="Prrafodelista"/>
+        <w:numPr>
+          <w:ilvl w:val="0"/>
+          <w:numId w:val="4"/>
+        </w:numPr>
+        <w:spacing w:line="276" w:lineRule="auto"/>
+        <w:jc w:val="both"/>
+        <w:rPr>
+          <w:lang w:val="es-AR"/>
+        </w:rPr>
+      </w:pPr>
       <w:proofErr w:type="spellStart"/>
       <w:r>
         <w:rPr>
@@ -56,8 +117,1643 @@
         <w:rPr>
           <w:lang w:val="es-AR"/>
         </w:rPr>
-        <w:t xml:space="preserve"> va a ser la encargada de crear conferencias y a los usuarios.</w:t>
-      </w:r>
+        <w:t>: Clase principal que administra las conferencias.</w:t>
+      </w:r>
+    </w:p>
+    <w:p>
+      <w:pPr>
+        <w:pStyle w:val="Prrafodelista"/>
+        <w:numPr>
+          <w:ilvl w:val="0"/>
+          <w:numId w:val="4"/>
+        </w:numPr>
+        <w:spacing w:line="276" w:lineRule="auto"/>
+        <w:jc w:val="both"/>
+        <w:rPr>
+          <w:lang w:val="es-AR"/>
+        </w:rPr>
+      </w:pPr>
+      <w:r>
+        <w:rPr>
+          <w:lang w:val="es-AR"/>
+        </w:rPr>
+        <w:t>Conferencia: Representa una conferencia específica con sesiones y participantes.</w:t>
+      </w:r>
+    </w:p>
+    <w:p>
+      <w:pPr>
+        <w:pStyle w:val="Prrafodelista"/>
+        <w:numPr>
+          <w:ilvl w:val="0"/>
+          <w:numId w:val="4"/>
+        </w:numPr>
+        <w:spacing w:line="276" w:lineRule="auto"/>
+        <w:jc w:val="both"/>
+        <w:rPr>
+          <w:lang w:val="es-AR"/>
+        </w:rPr>
+      </w:pPr>
+      <w:r>
+        <w:rPr>
+          <w:lang w:val="es-AR"/>
+        </w:rPr>
+        <w:t xml:space="preserve">Usuario: Clase abstracta que define a los distintos tipos de usuarios (Tipos de Usuarios: </w:t>
+      </w:r>
+      <w:proofErr w:type="spellStart"/>
+      <w:r>
+        <w:rPr>
+          <w:lang w:val="es-AR"/>
+        </w:rPr>
+        <w:t>Chairs</w:t>
+      </w:r>
+      <w:proofErr w:type="spellEnd"/>
+      <w:r>
+        <w:rPr>
+          <w:lang w:val="es-AR"/>
+        </w:rPr>
+        <w:t>, Autores, Revisores).</w:t>
+      </w:r>
+    </w:p>
+    <w:p>
+      <w:pPr>
+        <w:pStyle w:val="Prrafodelista"/>
+        <w:numPr>
+          <w:ilvl w:val="0"/>
+          <w:numId w:val="4"/>
+        </w:numPr>
+        <w:spacing w:line="276" w:lineRule="auto"/>
+        <w:jc w:val="both"/>
+        <w:rPr>
+          <w:lang w:val="es-AR"/>
+        </w:rPr>
+      </w:pPr>
+      <w:proofErr w:type="spellStart"/>
+      <w:r>
+        <w:rPr>
+          <w:lang w:val="es-AR"/>
+        </w:rPr>
+        <w:t>Sesion</w:t>
+      </w:r>
+      <w:proofErr w:type="spellEnd"/>
+      <w:r>
+        <w:rPr>
+          <w:lang w:val="es-AR"/>
+        </w:rPr>
+        <w:t>: Clase abstracta que representa sesiones dentro de una conferencia y maneja artículos y revisores. (Tipos de Sesiones: Poster, Regular, Wo</w:t>
+      </w:r>
+      <w:r>
+        <w:rPr>
+          <w:lang w:val="es-AR"/>
+        </w:rPr>
+        <w:t>r</w:t>
+      </w:r>
+      <w:r>
+        <w:rPr>
+          <w:lang w:val="es-AR"/>
+        </w:rPr>
+        <w:t>kshop).</w:t>
+      </w:r>
+    </w:p>
+    <w:p>
+      <w:pPr>
+        <w:pStyle w:val="Prrafodelista"/>
+        <w:numPr>
+          <w:ilvl w:val="0"/>
+          <w:numId w:val="4"/>
+        </w:numPr>
+        <w:spacing w:line="276" w:lineRule="auto"/>
+        <w:jc w:val="both"/>
+        <w:rPr>
+          <w:lang w:val="es-AR"/>
+        </w:rPr>
+      </w:pPr>
+      <w:proofErr w:type="spellStart"/>
+      <w:r>
+        <w:rPr>
+          <w:lang w:val="es-AR"/>
+        </w:rPr>
+        <w:t>EstadoSesion</w:t>
+      </w:r>
+      <w:proofErr w:type="spellEnd"/>
+      <w:r>
+        <w:rPr>
+          <w:lang w:val="es-AR"/>
+        </w:rPr>
+        <w:t xml:space="preserve">: Clase abstracta que define los estados de una sesión (Recepción, </w:t>
+      </w:r>
+      <w:proofErr w:type="spellStart"/>
+      <w:r>
+        <w:rPr>
+          <w:lang w:val="es-AR"/>
+        </w:rPr>
+        <w:t>Bidding</w:t>
+      </w:r>
+      <w:proofErr w:type="spellEnd"/>
+      <w:r>
+        <w:rPr>
+          <w:lang w:val="es-AR"/>
+        </w:rPr>
+        <w:t>, Asignación, Revisión y Selección).</w:t>
+      </w:r>
+    </w:p>
+    <w:p>
+      <w:pPr>
+        <w:pStyle w:val="Prrafodelista"/>
+        <w:numPr>
+          <w:ilvl w:val="0"/>
+          <w:numId w:val="4"/>
+        </w:numPr>
+        <w:spacing w:line="276" w:lineRule="auto"/>
+        <w:jc w:val="both"/>
+        <w:rPr>
+          <w:lang w:val="es-AR"/>
+        </w:rPr>
+      </w:pPr>
+      <w:r>
+        <w:rPr>
+          <w:lang w:val="es-AR"/>
+        </w:rPr>
+        <w:t>Estrategia: Clase abstracta que permite implementar distintas estrategias de selección de artículos. (Tipos de Estrategias: Por porcentaje de aceptados y por puntaje mínimo).</w:t>
+      </w:r>
+    </w:p>
+    <w:p>
+      <w:pPr>
+        <w:pStyle w:val="Prrafodelista"/>
+        <w:numPr>
+          <w:ilvl w:val="0"/>
+          <w:numId w:val="4"/>
+        </w:numPr>
+        <w:spacing w:line="276" w:lineRule="auto"/>
+        <w:jc w:val="both"/>
+        <w:rPr>
+          <w:lang w:val="es-AR"/>
+        </w:rPr>
+      </w:pPr>
+      <w:r>
+        <w:rPr>
+          <w:lang w:val="es-AR"/>
+        </w:rPr>
+        <w:t>Artículo: Representa un artículo enviado a una sesión (Tipos de Artículos: Regular y Poster).</w:t>
+      </w:r>
+      <w:r>
+        <w:rPr>
+          <w:lang w:val="es-AR"/>
+        </w:rPr>
+        <w:tab/>
+      </w:r>
+    </w:p>
+    <w:p>
+      <w:pPr>
+        <w:rPr>
+          <w:u w:val="single"/>
+          <w:lang w:val="es-AR"/>
+        </w:rPr>
+      </w:pPr>
+      <w:r>
+        <w:rPr>
+          <w:u w:val="single"/>
+          <w:lang w:val="es-AR"/>
+        </w:rPr>
+        <w:t>Relaciones entre clases</w:t>
+      </w:r>
+    </w:p>
+    <w:p>
+      <w:pPr>
+        <w:pStyle w:val="Prrafodelista"/>
+        <w:numPr>
+          <w:ilvl w:val="0"/>
+          <w:numId w:val="6"/>
+        </w:numPr>
+        <w:spacing w:line="276" w:lineRule="auto"/>
+        <w:jc w:val="both"/>
+        <w:rPr>
+          <w:lang w:val="es-AR"/>
+        </w:rPr>
+      </w:pPr>
+      <w:r>
+        <w:rPr>
+          <w:lang w:val="es-AR"/>
+        </w:rPr>
+        <w:t>Gest</w:t>
+      </w:r>
+      <w:r>
+        <w:rPr>
+          <w:lang w:val="es-AR"/>
+        </w:rPr>
+        <w:t>ión de conferencias</w:t>
+      </w:r>
+      <w:r>
+        <w:rPr>
+          <w:lang w:val="es-AR"/>
+        </w:rPr>
+        <w:t>:</w:t>
+      </w:r>
+    </w:p>
+    <w:p>
+      <w:pPr>
+        <w:pStyle w:val="Prrafodelista"/>
+        <w:numPr>
+          <w:ilvl w:val="0"/>
+          <w:numId w:val="7"/>
+        </w:numPr>
+        <w:spacing w:line="276" w:lineRule="auto"/>
+        <w:jc w:val="both"/>
+        <w:rPr>
+          <w:lang w:val="es-AR"/>
+        </w:rPr>
+      </w:pPr>
+      <w:proofErr w:type="spellStart"/>
+      <w:r>
+        <w:rPr>
+          <w:lang w:val="es-AR"/>
+        </w:rPr>
+        <w:t>Comfychair</w:t>
+      </w:r>
+      <w:proofErr w:type="spellEnd"/>
+      <w:r>
+        <w:rPr>
+          <w:lang w:val="es-AR"/>
+        </w:rPr>
+        <w:t xml:space="preserve"> gestiona Conferencias.</w:t>
+      </w:r>
+    </w:p>
+    <w:p>
+      <w:pPr>
+        <w:pStyle w:val="Prrafodelista"/>
+        <w:numPr>
+          <w:ilvl w:val="0"/>
+          <w:numId w:val="7"/>
+        </w:numPr>
+        <w:spacing w:line="276" w:lineRule="auto"/>
+        <w:jc w:val="both"/>
+        <w:rPr>
+          <w:lang w:val="es-AR"/>
+        </w:rPr>
+      </w:pPr>
+      <w:r>
+        <w:rPr>
+          <w:lang w:val="es-AR"/>
+        </w:rPr>
+        <w:t>Conferencias contienen Sesiones, Organizadores (</w:t>
+      </w:r>
+      <w:proofErr w:type="spellStart"/>
+      <w:r>
+        <w:rPr>
+          <w:lang w:val="es-AR"/>
+        </w:rPr>
+        <w:t>Chair</w:t>
+      </w:r>
+      <w:proofErr w:type="spellEnd"/>
+      <w:r>
+        <w:rPr>
+          <w:lang w:val="es-AR"/>
+        </w:rPr>
+        <w:t>) y Comités de revisores (Revisor).</w:t>
+      </w:r>
+    </w:p>
+    <w:p>
+      <w:pPr>
+        <w:pStyle w:val="Prrafodelista"/>
+        <w:numPr>
+          <w:ilvl w:val="0"/>
+          <w:numId w:val="7"/>
+        </w:numPr>
+        <w:spacing w:line="276" w:lineRule="auto"/>
+        <w:jc w:val="both"/>
+        <w:rPr>
+          <w:lang w:val="es-AR"/>
+        </w:rPr>
+      </w:pPr>
+      <w:r>
+        <w:rPr>
+          <w:lang w:val="es-AR"/>
+        </w:rPr>
+        <w:t>Conferencias pueden listar sus Sesiones, Organizadores y Comités.</w:t>
+      </w:r>
+    </w:p>
+    <w:p>
+      <w:pPr>
+        <w:pStyle w:val="Prrafodelista"/>
+        <w:numPr>
+          <w:ilvl w:val="0"/>
+          <w:numId w:val="5"/>
+        </w:numPr>
+        <w:spacing w:line="276" w:lineRule="auto"/>
+        <w:jc w:val="both"/>
+        <w:rPr>
+          <w:lang w:val="es-AR"/>
+        </w:rPr>
+      </w:pPr>
+      <w:r>
+        <w:rPr>
+          <w:lang w:val="es-AR"/>
+        </w:rPr>
+        <w:t>Herencia y abstracción:</w:t>
+      </w:r>
+    </w:p>
+    <w:p>
+      <w:pPr>
+        <w:pStyle w:val="Prrafodelista"/>
+        <w:numPr>
+          <w:ilvl w:val="0"/>
+          <w:numId w:val="8"/>
+        </w:numPr>
+        <w:spacing w:line="276" w:lineRule="auto"/>
+        <w:jc w:val="both"/>
+        <w:rPr>
+          <w:lang w:val="es-AR"/>
+        </w:rPr>
+      </w:pPr>
+      <w:r>
+        <w:rPr>
+          <w:lang w:val="es-AR"/>
+        </w:rPr>
+        <w:t xml:space="preserve">Usuario es una clase abstracta de la cual heredan </w:t>
+      </w:r>
+      <w:proofErr w:type="spellStart"/>
+      <w:r>
+        <w:rPr>
+          <w:lang w:val="es-AR"/>
+        </w:rPr>
+        <w:t>Chair</w:t>
+      </w:r>
+      <w:proofErr w:type="spellEnd"/>
+      <w:r>
+        <w:rPr>
+          <w:lang w:val="es-AR"/>
+        </w:rPr>
+        <w:t>, Autor y Revisor.</w:t>
+      </w:r>
+    </w:p>
+    <w:p>
+      <w:pPr>
+        <w:pStyle w:val="Prrafodelista"/>
+        <w:numPr>
+          <w:ilvl w:val="0"/>
+          <w:numId w:val="8"/>
+        </w:numPr>
+        <w:spacing w:line="276" w:lineRule="auto"/>
+        <w:jc w:val="both"/>
+        <w:rPr>
+          <w:lang w:val="es-AR"/>
+        </w:rPr>
+      </w:pPr>
+      <w:proofErr w:type="spellStart"/>
+      <w:r>
+        <w:rPr>
+          <w:lang w:val="es-AR"/>
+        </w:rPr>
+        <w:t>Sesion</w:t>
+      </w:r>
+      <w:proofErr w:type="spellEnd"/>
+      <w:r>
+        <w:rPr>
+          <w:lang w:val="es-AR"/>
+        </w:rPr>
+        <w:t xml:space="preserve"> es una clase abstracta de la cual heredan </w:t>
+      </w:r>
+      <w:proofErr w:type="spellStart"/>
+      <w:r>
+        <w:rPr>
+          <w:lang w:val="es-AR"/>
+        </w:rPr>
+        <w:t>SesionPoster</w:t>
+      </w:r>
+      <w:proofErr w:type="spellEnd"/>
+      <w:r>
+        <w:rPr>
+          <w:lang w:val="es-AR"/>
+        </w:rPr>
+        <w:t xml:space="preserve">, </w:t>
+      </w:r>
+      <w:proofErr w:type="spellStart"/>
+      <w:r>
+        <w:rPr>
+          <w:lang w:val="es-AR"/>
+        </w:rPr>
+        <w:t>SesionRegular</w:t>
+      </w:r>
+      <w:proofErr w:type="spellEnd"/>
+      <w:r>
+        <w:rPr>
+          <w:lang w:val="es-AR"/>
+        </w:rPr>
+        <w:t xml:space="preserve"> y </w:t>
+      </w:r>
+      <w:proofErr w:type="spellStart"/>
+      <w:r>
+        <w:rPr>
+          <w:lang w:val="es-AR"/>
+        </w:rPr>
+        <w:t>SesionWorkshop</w:t>
+      </w:r>
+      <w:proofErr w:type="spellEnd"/>
+      <w:r>
+        <w:rPr>
+          <w:lang w:val="es-AR"/>
+        </w:rPr>
+        <w:t>.</w:t>
+      </w:r>
+    </w:p>
+    <w:p>
+      <w:pPr>
+        <w:pStyle w:val="Prrafodelista"/>
+        <w:numPr>
+          <w:ilvl w:val="0"/>
+          <w:numId w:val="8"/>
+        </w:numPr>
+        <w:spacing w:line="276" w:lineRule="auto"/>
+        <w:jc w:val="both"/>
+        <w:rPr>
+          <w:lang w:val="es-AR"/>
+        </w:rPr>
+      </w:pPr>
+      <w:proofErr w:type="spellStart"/>
+      <w:r>
+        <w:rPr>
+          <w:lang w:val="es-AR"/>
+        </w:rPr>
+        <w:t>EstadoSesion</w:t>
+      </w:r>
+      <w:proofErr w:type="spellEnd"/>
+      <w:r>
+        <w:rPr>
+          <w:lang w:val="es-AR"/>
+        </w:rPr>
+        <w:t xml:space="preserve"> es una clase abstracta con múltiples estados concretos (</w:t>
+      </w:r>
+      <w:proofErr w:type="spellStart"/>
+      <w:r>
+        <w:rPr>
+          <w:lang w:val="es-AR"/>
+        </w:rPr>
+        <w:t>EstadoRecepcion</w:t>
+      </w:r>
+      <w:proofErr w:type="spellEnd"/>
+      <w:r>
+        <w:rPr>
+          <w:lang w:val="es-AR"/>
+        </w:rPr>
+        <w:t xml:space="preserve">, </w:t>
+      </w:r>
+      <w:proofErr w:type="spellStart"/>
+      <w:r>
+        <w:rPr>
+          <w:lang w:val="es-AR"/>
+        </w:rPr>
+        <w:t>EstadoBidding</w:t>
+      </w:r>
+      <w:proofErr w:type="spellEnd"/>
+      <w:r>
+        <w:rPr>
+          <w:lang w:val="es-AR"/>
+        </w:rPr>
+        <w:t xml:space="preserve">, </w:t>
+      </w:r>
+      <w:proofErr w:type="spellStart"/>
+      <w:r>
+        <w:rPr>
+          <w:lang w:val="es-AR"/>
+        </w:rPr>
+        <w:t>EstadoAsignacion</w:t>
+      </w:r>
+      <w:proofErr w:type="spellEnd"/>
+      <w:r>
+        <w:rPr>
+          <w:lang w:val="es-AR"/>
+        </w:rPr>
+        <w:t xml:space="preserve">, </w:t>
+      </w:r>
+      <w:proofErr w:type="spellStart"/>
+      <w:r>
+        <w:rPr>
+          <w:lang w:val="es-AR"/>
+        </w:rPr>
+        <w:t>EstadoRevision</w:t>
+      </w:r>
+      <w:proofErr w:type="spellEnd"/>
+      <w:r>
+        <w:rPr>
+          <w:lang w:val="es-AR"/>
+        </w:rPr>
+        <w:t xml:space="preserve">, </w:t>
+      </w:r>
+      <w:proofErr w:type="spellStart"/>
+      <w:r>
+        <w:rPr>
+          <w:lang w:val="es-AR"/>
+        </w:rPr>
+        <w:t>EstadoSeleccion</w:t>
+      </w:r>
+      <w:proofErr w:type="spellEnd"/>
+      <w:r>
+        <w:rPr>
+          <w:lang w:val="es-AR"/>
+        </w:rPr>
+        <w:t>).</w:t>
+      </w:r>
+    </w:p>
+    <w:p>
+      <w:pPr>
+        <w:pStyle w:val="Prrafodelista"/>
+        <w:numPr>
+          <w:ilvl w:val="0"/>
+          <w:numId w:val="8"/>
+        </w:numPr>
+        <w:spacing w:line="276" w:lineRule="auto"/>
+        <w:jc w:val="both"/>
+        <w:rPr>
+          <w:lang w:val="es-AR"/>
+        </w:rPr>
+      </w:pPr>
+      <w:r>
+        <w:rPr>
+          <w:lang w:val="es-AR"/>
+        </w:rPr>
+        <w:t>Estrategia es una clase abstracta con implementaciones (</w:t>
+      </w:r>
+      <w:proofErr w:type="spellStart"/>
+      <w:r>
+        <w:rPr>
+          <w:lang w:val="es-AR"/>
+        </w:rPr>
+        <w:t>PorcentajeDeAceptados</w:t>
+      </w:r>
+      <w:proofErr w:type="spellEnd"/>
+      <w:r>
+        <w:rPr>
+          <w:lang w:val="es-AR"/>
+        </w:rPr>
+        <w:t xml:space="preserve">, </w:t>
+      </w:r>
+      <w:proofErr w:type="spellStart"/>
+      <w:r>
+        <w:rPr>
+          <w:lang w:val="es-AR"/>
+        </w:rPr>
+        <w:t>PuntajeMinimo</w:t>
+      </w:r>
+      <w:proofErr w:type="spellEnd"/>
+      <w:r>
+        <w:rPr>
+          <w:lang w:val="es-AR"/>
+        </w:rPr>
+        <w:t>).</w:t>
+      </w:r>
+    </w:p>
+    <w:p>
+      <w:pPr>
+        <w:pStyle w:val="Prrafodelista"/>
+        <w:numPr>
+          <w:ilvl w:val="0"/>
+          <w:numId w:val="8"/>
+        </w:numPr>
+        <w:spacing w:line="276" w:lineRule="auto"/>
+        <w:jc w:val="both"/>
+        <w:rPr>
+          <w:lang w:val="es-AR"/>
+        </w:rPr>
+      </w:pPr>
+      <w:proofErr w:type="spellStart"/>
+      <w:r>
+        <w:rPr>
+          <w:lang w:val="es-AR"/>
+        </w:rPr>
+        <w:t>Articulo</w:t>
+      </w:r>
+      <w:proofErr w:type="spellEnd"/>
+      <w:r>
+        <w:rPr>
+          <w:lang w:val="es-AR"/>
+        </w:rPr>
+        <w:t xml:space="preserve"> es una clase abstracta con implementaciones (</w:t>
+      </w:r>
+      <w:proofErr w:type="spellStart"/>
+      <w:r>
+        <w:rPr>
+          <w:lang w:val="es-AR"/>
+        </w:rPr>
+        <w:t>ArticuloRegular</w:t>
+      </w:r>
+      <w:proofErr w:type="spellEnd"/>
+      <w:r>
+        <w:rPr>
+          <w:lang w:val="es-AR"/>
+        </w:rPr>
+        <w:t xml:space="preserve">, </w:t>
+      </w:r>
+      <w:proofErr w:type="spellStart"/>
+      <w:r>
+        <w:rPr>
+          <w:lang w:val="es-AR"/>
+        </w:rPr>
+        <w:t>ArticuloPoster</w:t>
+      </w:r>
+      <w:proofErr w:type="spellEnd"/>
+      <w:r>
+        <w:rPr>
+          <w:lang w:val="es-AR"/>
+        </w:rPr>
+        <w:t>).</w:t>
+      </w:r>
+    </w:p>
+    <w:p>
+      <w:pPr>
+        <w:pStyle w:val="Prrafodelista"/>
+        <w:numPr>
+          <w:ilvl w:val="0"/>
+          <w:numId w:val="5"/>
+        </w:numPr>
+        <w:spacing w:line="276" w:lineRule="auto"/>
+        <w:jc w:val="both"/>
+        <w:rPr>
+          <w:lang w:val="es-AR"/>
+        </w:rPr>
+      </w:pPr>
+      <w:r>
+        <w:rPr>
+          <w:lang w:val="es-AR"/>
+        </w:rPr>
+        <w:t>Estados de sesión y flujo de trabajo:</w:t>
+      </w:r>
+    </w:p>
+    <w:p>
+      <w:pPr>
+        <w:pStyle w:val="Prrafodelista"/>
+        <w:numPr>
+          <w:ilvl w:val="0"/>
+          <w:numId w:val="9"/>
+        </w:numPr>
+        <w:spacing w:line="276" w:lineRule="auto"/>
+        <w:jc w:val="both"/>
+        <w:rPr>
+          <w:lang w:val="es-AR"/>
+        </w:rPr>
+      </w:pPr>
+      <w:proofErr w:type="spellStart"/>
+      <w:r>
+        <w:rPr>
+          <w:lang w:val="es-AR"/>
+        </w:rPr>
+        <w:t>EstadoSesion</w:t>
+      </w:r>
+      <w:proofErr w:type="spellEnd"/>
+      <w:r>
+        <w:rPr>
+          <w:lang w:val="es-AR"/>
+        </w:rPr>
+        <w:t xml:space="preserve"> controla la transición entre los estados de una sesión.</w:t>
+      </w:r>
+    </w:p>
+    <w:p>
+      <w:pPr>
+        <w:pStyle w:val="Prrafodelista"/>
+        <w:numPr>
+          <w:ilvl w:val="0"/>
+          <w:numId w:val="9"/>
+        </w:numPr>
+        <w:spacing w:line="276" w:lineRule="auto"/>
+        <w:jc w:val="both"/>
+        <w:rPr>
+          <w:lang w:val="es-AR"/>
+        </w:rPr>
+      </w:pPr>
+      <w:proofErr w:type="spellStart"/>
+      <w:r>
+        <w:rPr>
+          <w:lang w:val="es-AR"/>
+        </w:rPr>
+        <w:t>Sesion</w:t>
+      </w:r>
+      <w:proofErr w:type="spellEnd"/>
+      <w:r>
+        <w:rPr>
+          <w:lang w:val="es-AR"/>
+        </w:rPr>
+        <w:t xml:space="preserve"> mantiene una referencia a </w:t>
+      </w:r>
+      <w:proofErr w:type="spellStart"/>
+      <w:r>
+        <w:rPr>
+          <w:lang w:val="es-AR"/>
+        </w:rPr>
+        <w:t>EstadoSesion</w:t>
+      </w:r>
+      <w:proofErr w:type="spellEnd"/>
+      <w:r>
+        <w:rPr>
+          <w:lang w:val="es-AR"/>
+        </w:rPr>
+        <w:t>, lo que permite cambiar su estado dinámicamente.</w:t>
+      </w:r>
+    </w:p>
+    <w:p>
+      <w:pPr>
+        <w:pStyle w:val="Prrafodelista"/>
+        <w:numPr>
+          <w:ilvl w:val="0"/>
+          <w:numId w:val="9"/>
+        </w:numPr>
+        <w:spacing w:line="276" w:lineRule="auto"/>
+        <w:jc w:val="both"/>
+        <w:rPr>
+          <w:lang w:val="es-AR"/>
+        </w:rPr>
+      </w:pPr>
+      <w:r>
+        <w:rPr>
+          <w:lang w:val="es-AR"/>
+        </w:rPr>
+        <w:lastRenderedPageBreak/>
+        <w:t>Cada estado (</w:t>
+      </w:r>
+      <w:proofErr w:type="spellStart"/>
+      <w:r>
+        <w:rPr>
+          <w:lang w:val="es-AR"/>
+        </w:rPr>
+        <w:t>EstadoRecepcion</w:t>
+      </w:r>
+      <w:proofErr w:type="spellEnd"/>
+      <w:r>
+        <w:rPr>
+          <w:lang w:val="es-AR"/>
+        </w:rPr>
+        <w:t xml:space="preserve">, </w:t>
+      </w:r>
+      <w:proofErr w:type="spellStart"/>
+      <w:r>
+        <w:rPr>
+          <w:lang w:val="es-AR"/>
+        </w:rPr>
+        <w:t>EstadoBidding</w:t>
+      </w:r>
+      <w:proofErr w:type="spellEnd"/>
+      <w:r>
+        <w:rPr>
+          <w:lang w:val="es-AR"/>
+        </w:rPr>
+        <w:t>, etc.) define su comportamiento específico.</w:t>
+      </w:r>
+    </w:p>
+    <w:p>
+      <w:pPr>
+        <w:pStyle w:val="Prrafodelista"/>
+        <w:numPr>
+          <w:ilvl w:val="0"/>
+          <w:numId w:val="5"/>
+        </w:numPr>
+        <w:spacing w:line="276" w:lineRule="auto"/>
+        <w:jc w:val="both"/>
+        <w:rPr>
+          <w:lang w:val="es-AR"/>
+        </w:rPr>
+      </w:pPr>
+      <w:r>
+        <w:rPr>
+          <w:lang w:val="es-AR"/>
+        </w:rPr>
+        <w:t>Estrategias de selección de artículos:</w:t>
+      </w:r>
+    </w:p>
+    <w:p>
+      <w:pPr>
+        <w:pStyle w:val="Prrafodelista"/>
+        <w:numPr>
+          <w:ilvl w:val="0"/>
+          <w:numId w:val="10"/>
+        </w:numPr>
+        <w:spacing w:line="276" w:lineRule="auto"/>
+        <w:jc w:val="both"/>
+        <w:rPr>
+          <w:lang w:val="es-AR"/>
+        </w:rPr>
+      </w:pPr>
+      <w:proofErr w:type="spellStart"/>
+      <w:r>
+        <w:rPr>
+          <w:lang w:val="es-AR"/>
+        </w:rPr>
+        <w:t>Sesion</w:t>
+      </w:r>
+      <w:proofErr w:type="spellEnd"/>
+      <w:r>
+        <w:rPr>
+          <w:lang w:val="es-AR"/>
+        </w:rPr>
+        <w:t xml:space="preserve"> usa Estrategia para seleccionar artículos aceptados.</w:t>
+      </w:r>
+    </w:p>
+    <w:p>
+      <w:pPr>
+        <w:pStyle w:val="Prrafodelista"/>
+        <w:numPr>
+          <w:ilvl w:val="0"/>
+          <w:numId w:val="10"/>
+        </w:numPr>
+        <w:spacing w:line="276" w:lineRule="auto"/>
+        <w:jc w:val="both"/>
+        <w:rPr>
+          <w:lang w:val="es-AR"/>
+        </w:rPr>
+      </w:pPr>
+      <w:r>
+        <w:rPr>
+          <w:lang w:val="es-AR"/>
+        </w:rPr>
+        <w:t xml:space="preserve">Estrategia puede ser </w:t>
+      </w:r>
+      <w:proofErr w:type="spellStart"/>
+      <w:r>
+        <w:rPr>
+          <w:lang w:val="es-AR"/>
+        </w:rPr>
+        <w:t>PorcentajeDeAceptados</w:t>
+      </w:r>
+      <w:proofErr w:type="spellEnd"/>
+      <w:r>
+        <w:rPr>
+          <w:lang w:val="es-AR"/>
+        </w:rPr>
+        <w:t xml:space="preserve"> o </w:t>
+      </w:r>
+      <w:proofErr w:type="spellStart"/>
+      <w:r>
+        <w:rPr>
+          <w:lang w:val="es-AR"/>
+        </w:rPr>
+        <w:t>PuntajeMinimo</w:t>
+      </w:r>
+      <w:proofErr w:type="spellEnd"/>
+      <w:r>
+        <w:rPr>
+          <w:lang w:val="es-AR"/>
+        </w:rPr>
+        <w:t>.</w:t>
+      </w:r>
+    </w:p>
+    <w:p>
+      <w:pPr>
+        <w:pStyle w:val="Prrafodelista"/>
+        <w:numPr>
+          <w:ilvl w:val="0"/>
+          <w:numId w:val="10"/>
+        </w:numPr>
+        <w:spacing w:line="276" w:lineRule="auto"/>
+        <w:jc w:val="both"/>
+        <w:rPr>
+          <w:lang w:val="es-AR"/>
+        </w:rPr>
+      </w:pPr>
+      <w:r>
+        <w:rPr>
+          <w:lang w:val="es-AR"/>
+        </w:rPr>
+        <w:t>Cada estrategia define diferentes criterios para la aceptación de artículos.</w:t>
+      </w:r>
+    </w:p>
+    <w:p>
+      <w:pPr>
+        <w:pStyle w:val="Prrafodelista"/>
+        <w:numPr>
+          <w:ilvl w:val="0"/>
+          <w:numId w:val="5"/>
+        </w:numPr>
+        <w:spacing w:line="276" w:lineRule="auto"/>
+        <w:jc w:val="both"/>
+        <w:rPr>
+          <w:lang w:val="es-AR"/>
+        </w:rPr>
+      </w:pPr>
+      <w:r>
+        <w:rPr>
+          <w:lang w:val="es-AR"/>
+        </w:rPr>
+        <w:t>Revisión de artículos:</w:t>
+      </w:r>
+    </w:p>
+    <w:p>
+      <w:pPr>
+        <w:pStyle w:val="Prrafodelista"/>
+        <w:numPr>
+          <w:ilvl w:val="0"/>
+          <w:numId w:val="12"/>
+        </w:numPr>
+        <w:spacing w:line="276" w:lineRule="auto"/>
+        <w:jc w:val="both"/>
+        <w:rPr>
+          <w:lang w:val="es-AR"/>
+        </w:rPr>
+      </w:pPr>
+      <w:proofErr w:type="spellStart"/>
+      <w:r>
+        <w:rPr>
+          <w:lang w:val="es-AR"/>
+        </w:rPr>
+        <w:t>Sesion</w:t>
+      </w:r>
+      <w:proofErr w:type="spellEnd"/>
+      <w:r>
+        <w:rPr>
+          <w:lang w:val="es-AR"/>
+        </w:rPr>
+        <w:t xml:space="preserve"> almacena Articulo y asigna Revisor para evaluar.</w:t>
+      </w:r>
+    </w:p>
+    <w:p>
+      <w:pPr>
+        <w:pStyle w:val="Prrafodelista"/>
+        <w:numPr>
+          <w:ilvl w:val="0"/>
+          <w:numId w:val="12"/>
+        </w:numPr>
+        <w:spacing w:line="276" w:lineRule="auto"/>
+        <w:jc w:val="both"/>
+        <w:rPr>
+          <w:lang w:val="es-AR"/>
+        </w:rPr>
+      </w:pPr>
+      <w:r>
+        <w:rPr>
+          <w:lang w:val="es-AR"/>
+        </w:rPr>
+        <w:t>Articulo registra el interés de revisores y mantiene asignaciones.</w:t>
+      </w:r>
+    </w:p>
+    <w:p>
+      <w:pPr>
+        <w:pStyle w:val="Prrafodelista"/>
+        <w:numPr>
+          <w:ilvl w:val="0"/>
+          <w:numId w:val="12"/>
+        </w:numPr>
+        <w:spacing w:line="276" w:lineRule="auto"/>
+        <w:jc w:val="both"/>
+        <w:rPr>
+          <w:lang w:val="es-AR"/>
+        </w:rPr>
+      </w:pPr>
+      <w:r>
+        <w:rPr>
+          <w:lang w:val="es-AR"/>
+        </w:rPr>
+        <w:t>Revisor expresa interés en artículos y puntúa según su revisión.</w:t>
+      </w:r>
+    </w:p>
+    <w:p>
+      <w:pPr>
+        <w:rPr>
+          <w:u w:val="single"/>
+          <w:lang w:val="es-AR"/>
+        </w:rPr>
+      </w:pPr>
+      <w:r>
+        <w:rPr>
+          <w:u w:val="single"/>
+          <w:lang w:val="es-AR"/>
+        </w:rPr>
+        <w:t>Patrones de Diseño Utilizados</w:t>
+      </w:r>
+    </w:p>
+    <w:p>
+      <w:pPr>
+        <w:pStyle w:val="Prrafodelista"/>
+        <w:numPr>
+          <w:ilvl w:val="0"/>
+          <w:numId w:val="13"/>
+        </w:numPr>
+        <w:rPr>
+          <w:lang w:val="es-AR"/>
+        </w:rPr>
+      </w:pPr>
+      <w:r>
+        <w:rPr>
+          <w:lang w:val="es-AR"/>
+        </w:rPr>
+        <w:t xml:space="preserve">Factory </w:t>
+      </w:r>
+      <w:proofErr w:type="spellStart"/>
+      <w:r>
+        <w:rPr>
+          <w:lang w:val="es-AR"/>
+        </w:rPr>
+        <w:t>Method</w:t>
+      </w:r>
+      <w:proofErr w:type="spellEnd"/>
+    </w:p>
+    <w:p>
+      <w:pPr>
+        <w:pStyle w:val="Prrafodelista"/>
+        <w:numPr>
+          <w:ilvl w:val="1"/>
+          <w:numId w:val="5"/>
+        </w:numPr>
+        <w:spacing w:line="276" w:lineRule="auto"/>
+        <w:jc w:val="both"/>
+        <w:rPr>
+          <w:lang w:val="es-AR"/>
+        </w:rPr>
+      </w:pPr>
+      <w:r>
+        <w:rPr>
+          <w:lang w:val="es-AR"/>
+        </w:rPr>
+        <w:t>Aplicado en la creación de sesiones, permitiendo instanciar subclases específicas (</w:t>
+      </w:r>
+      <w:proofErr w:type="spellStart"/>
+      <w:r>
+        <w:rPr>
+          <w:lang w:val="es-AR"/>
+        </w:rPr>
+        <w:t>SesionRegular</w:t>
+      </w:r>
+      <w:proofErr w:type="spellEnd"/>
+      <w:r>
+        <w:rPr>
+          <w:lang w:val="es-AR"/>
+        </w:rPr>
+        <w:t xml:space="preserve">, </w:t>
+      </w:r>
+      <w:proofErr w:type="spellStart"/>
+      <w:r>
+        <w:rPr>
+          <w:lang w:val="es-AR"/>
+        </w:rPr>
+        <w:t>SesionPoster</w:t>
+      </w:r>
+      <w:proofErr w:type="spellEnd"/>
+      <w:r>
+        <w:rPr>
+          <w:lang w:val="es-AR"/>
+        </w:rPr>
+        <w:t xml:space="preserve">, </w:t>
+      </w:r>
+      <w:proofErr w:type="spellStart"/>
+      <w:r>
+        <w:rPr>
+          <w:lang w:val="es-AR"/>
+        </w:rPr>
+        <w:t>SesionWorkshop</w:t>
+      </w:r>
+      <w:proofErr w:type="spellEnd"/>
+      <w:r>
+        <w:rPr>
+          <w:lang w:val="es-AR"/>
+        </w:rPr>
+        <w:t xml:space="preserve">) según el contexto, siendo la clase Conferencia la que tiene el método </w:t>
+      </w:r>
+      <w:proofErr w:type="spellStart"/>
+      <w:proofErr w:type="gramStart"/>
+      <w:r>
+        <w:rPr>
+          <w:lang w:val="es-AR"/>
+        </w:rPr>
+        <w:t>crearSesion</w:t>
+      </w:r>
+      <w:proofErr w:type="spellEnd"/>
+      <w:r>
+        <w:rPr>
+          <w:lang w:val="es-AR"/>
+        </w:rPr>
+        <w:t>(</w:t>
+      </w:r>
+      <w:proofErr w:type="gramEnd"/>
+      <w:r>
+        <w:rPr>
+          <w:lang w:val="es-AR"/>
+        </w:rPr>
+        <w:t>) y dependiendo del tipo de sesión instancia la subclase concreta.</w:t>
+      </w:r>
+    </w:p>
+    <w:p>
+      <w:pPr>
+        <w:pStyle w:val="Prrafodelista"/>
+        <w:numPr>
+          <w:ilvl w:val="0"/>
+          <w:numId w:val="13"/>
+        </w:numPr>
+        <w:rPr>
+          <w:lang w:val="es-AR"/>
+        </w:rPr>
+      </w:pPr>
+      <w:proofErr w:type="spellStart"/>
+      <w:r>
+        <w:rPr>
+          <w:lang w:val="es-AR"/>
+        </w:rPr>
+        <w:t>Strategy</w:t>
+      </w:r>
+      <w:proofErr w:type="spellEnd"/>
+      <w:r>
+        <w:rPr>
+          <w:lang w:val="es-AR"/>
+        </w:rPr>
+        <w:t>:</w:t>
+      </w:r>
+    </w:p>
+    <w:p>
+      <w:pPr>
+        <w:pStyle w:val="Prrafodelista"/>
+        <w:numPr>
+          <w:ilvl w:val="1"/>
+          <w:numId w:val="5"/>
+        </w:numPr>
+        <w:jc w:val="both"/>
+        <w:rPr>
+          <w:lang w:val="es-AR"/>
+        </w:rPr>
+      </w:pPr>
+      <w:r>
+        <w:rPr>
+          <w:lang w:val="es-AR"/>
+        </w:rPr>
+        <w:t xml:space="preserve">Implementado en la Selección de artículos dentro de una sesión mediante las Estrategias: </w:t>
+      </w:r>
+      <w:proofErr w:type="spellStart"/>
+      <w:r>
+        <w:rPr>
+          <w:lang w:val="es-AR"/>
+        </w:rPr>
+        <w:t>PorcentajeDeAceptados</w:t>
+      </w:r>
+      <w:proofErr w:type="spellEnd"/>
+      <w:r>
+        <w:rPr>
+          <w:lang w:val="es-AR"/>
+        </w:rPr>
+        <w:t xml:space="preserve"> y </w:t>
+      </w:r>
+      <w:proofErr w:type="spellStart"/>
+      <w:r>
+        <w:rPr>
+          <w:lang w:val="es-AR"/>
+        </w:rPr>
+        <w:t>PuntajeMinimo</w:t>
+      </w:r>
+      <w:proofErr w:type="spellEnd"/>
+      <w:r>
+        <w:rPr>
+          <w:lang w:val="es-AR"/>
+        </w:rPr>
+        <w:t xml:space="preserve">. La sesión permite establecer una estrategia de selección de artículos, la sesión usa la estrategia asignada y éstas se pueden intercambiar sin modificar la sesión. En Estrategia tengo la interfaz común y la estrategia concreta </w:t>
+      </w:r>
+      <w:proofErr w:type="spellStart"/>
+      <w:r>
+        <w:rPr>
+          <w:lang w:val="es-AR"/>
+        </w:rPr>
+        <w:t>sobreescribe</w:t>
+      </w:r>
+      <w:proofErr w:type="spellEnd"/>
+      <w:r>
+        <w:rPr>
+          <w:lang w:val="es-AR"/>
+        </w:rPr>
+        <w:t xml:space="preserve"> el método seleccionar(</w:t>
+      </w:r>
+      <w:proofErr w:type="spellStart"/>
+      <w:r>
+        <w:rPr>
+          <w:lang w:val="es-AR"/>
+        </w:rPr>
+        <w:t>sesion</w:t>
+      </w:r>
+      <w:proofErr w:type="spellEnd"/>
+      <w:r>
+        <w:rPr>
+          <w:lang w:val="es-AR"/>
+        </w:rPr>
+        <w:t>).</w:t>
+      </w:r>
+    </w:p>
+    <w:p>
+      <w:pPr>
+        <w:pStyle w:val="Prrafodelista"/>
+        <w:numPr>
+          <w:ilvl w:val="0"/>
+          <w:numId w:val="13"/>
+        </w:numPr>
+        <w:jc w:val="both"/>
+        <w:rPr>
+          <w:lang w:val="es-AR"/>
+        </w:rPr>
+      </w:pPr>
+      <w:proofErr w:type="spellStart"/>
+      <w:r>
+        <w:rPr>
+          <w:lang w:val="es-AR"/>
+        </w:rPr>
+        <w:t>State</w:t>
+      </w:r>
+      <w:proofErr w:type="spellEnd"/>
+      <w:r>
+        <w:rPr>
+          <w:lang w:val="es-AR"/>
+        </w:rPr>
+        <w:t>:</w:t>
+      </w:r>
+    </w:p>
+    <w:p>
+      <w:pPr>
+        <w:pStyle w:val="Prrafodelista"/>
+        <w:numPr>
+          <w:ilvl w:val="1"/>
+          <w:numId w:val="5"/>
+        </w:numPr>
+        <w:jc w:val="both"/>
+        <w:rPr>
+          <w:lang w:val="es-AR"/>
+        </w:rPr>
+      </w:pPr>
+      <w:r>
+        <w:rPr>
+          <w:lang w:val="es-AR"/>
+        </w:rPr>
+        <w:t>Aplicado a la gestión de los Estados de una sesión. Se define una jerarquía de estados (</w:t>
+      </w:r>
+      <w:proofErr w:type="spellStart"/>
+      <w:r>
+        <w:rPr>
+          <w:lang w:val="es-AR"/>
+        </w:rPr>
+        <w:t>EstadoRecepcion</w:t>
+      </w:r>
+      <w:proofErr w:type="spellEnd"/>
+      <w:r>
+        <w:rPr>
+          <w:lang w:val="es-AR"/>
+        </w:rPr>
+        <w:t xml:space="preserve">, </w:t>
+      </w:r>
+      <w:proofErr w:type="spellStart"/>
+      <w:r>
+        <w:rPr>
+          <w:lang w:val="es-AR"/>
+        </w:rPr>
+        <w:t>EstadoBidding</w:t>
+      </w:r>
+      <w:proofErr w:type="spellEnd"/>
+      <w:r>
+        <w:rPr>
+          <w:lang w:val="es-AR"/>
+        </w:rPr>
+        <w:t xml:space="preserve">, </w:t>
+      </w:r>
+      <w:proofErr w:type="spellStart"/>
+      <w:r>
+        <w:rPr>
+          <w:lang w:val="es-AR"/>
+        </w:rPr>
+        <w:t>EstadoAsignacion</w:t>
+      </w:r>
+      <w:proofErr w:type="spellEnd"/>
+      <w:r>
+        <w:rPr>
+          <w:lang w:val="es-AR"/>
+        </w:rPr>
+        <w:t xml:space="preserve">, </w:t>
+      </w:r>
+      <w:proofErr w:type="spellStart"/>
+      <w:r>
+        <w:rPr>
+          <w:lang w:val="es-AR"/>
+        </w:rPr>
+        <w:t>EstadoRevision</w:t>
+      </w:r>
+      <w:proofErr w:type="spellEnd"/>
+      <w:r>
+        <w:rPr>
+          <w:lang w:val="es-AR"/>
+        </w:rPr>
+        <w:t xml:space="preserve">, </w:t>
+      </w:r>
+      <w:proofErr w:type="spellStart"/>
+      <w:r>
+        <w:rPr>
+          <w:lang w:val="es-AR"/>
+        </w:rPr>
+        <w:t>EstadoSeleccion</w:t>
+      </w:r>
+      <w:proofErr w:type="spellEnd"/>
+      <w:r>
+        <w:rPr>
+          <w:lang w:val="es-AR"/>
+        </w:rPr>
+        <w:t>), permitiendo las transiciones entre ellos. Este patrón permite que un objeto cambie su comportamiento en función del estado en el que se encuentre. En la sesión se mantiene una referencia a un estado y delega su comportamiento a dicho estado. Tiene una interfaz común (</w:t>
+      </w:r>
+      <w:proofErr w:type="spellStart"/>
+      <w:r>
+        <w:rPr>
+          <w:lang w:val="es-AR"/>
+        </w:rPr>
+        <w:t>EstadoS</w:t>
+      </w:r>
+      <w:r>
+        <w:rPr>
+          <w:lang w:val="es-AR"/>
+        </w:rPr>
+        <w:t>esion</w:t>
+      </w:r>
+      <w:proofErr w:type="spellEnd"/>
+      <w:r>
+        <w:rPr>
+          <w:lang w:val="es-AR"/>
+        </w:rPr>
+        <w:t xml:space="preserve">) y los estados concretos </w:t>
+      </w:r>
+      <w:r>
+        <w:rPr>
+          <w:lang w:val="es-AR"/>
+        </w:rPr>
+        <w:t xml:space="preserve">que implementan el comportamiento </w:t>
+      </w:r>
+      <w:proofErr w:type="gramStart"/>
+      <w:r>
+        <w:rPr>
+          <w:lang w:val="es-AR"/>
+        </w:rPr>
+        <w:t>específico  (</w:t>
+      </w:r>
+      <w:proofErr w:type="spellStart"/>
+      <w:proofErr w:type="gramEnd"/>
+      <w:r>
+        <w:rPr>
+          <w:lang w:val="es-AR"/>
+        </w:rPr>
+        <w:t>EstadoRecepcion</w:t>
+      </w:r>
+      <w:proofErr w:type="spellEnd"/>
+      <w:r>
+        <w:rPr>
+          <w:lang w:val="es-AR"/>
+        </w:rPr>
+        <w:t xml:space="preserve">, </w:t>
+      </w:r>
+      <w:proofErr w:type="spellStart"/>
+      <w:r>
+        <w:rPr>
+          <w:lang w:val="es-AR"/>
+        </w:rPr>
+        <w:t>EstadoBidding</w:t>
+      </w:r>
+      <w:proofErr w:type="spellEnd"/>
+      <w:r>
+        <w:rPr>
+          <w:lang w:val="es-AR"/>
+        </w:rPr>
+        <w:t xml:space="preserve">, </w:t>
+      </w:r>
+      <w:proofErr w:type="spellStart"/>
+      <w:r>
+        <w:rPr>
+          <w:lang w:val="es-AR"/>
+        </w:rPr>
+        <w:t>EstadoAsignacion</w:t>
+      </w:r>
+      <w:proofErr w:type="spellEnd"/>
+      <w:r>
+        <w:rPr>
+          <w:lang w:val="es-AR"/>
+        </w:rPr>
+        <w:t xml:space="preserve">, </w:t>
+      </w:r>
+      <w:proofErr w:type="spellStart"/>
+      <w:r>
+        <w:rPr>
+          <w:lang w:val="es-AR"/>
+        </w:rPr>
+        <w:t>EstadoRevision</w:t>
+      </w:r>
+      <w:proofErr w:type="spellEnd"/>
+      <w:r>
+        <w:rPr>
+          <w:lang w:val="es-AR"/>
+        </w:rPr>
+        <w:t xml:space="preserve">, </w:t>
+      </w:r>
+      <w:proofErr w:type="spellStart"/>
+      <w:r>
+        <w:rPr>
+          <w:lang w:val="es-AR"/>
+        </w:rPr>
+        <w:t>EstadoSeleccion</w:t>
+      </w:r>
+      <w:proofErr w:type="spellEnd"/>
+      <w:r>
+        <w:rPr>
+          <w:lang w:val="es-AR"/>
+        </w:rPr>
+        <w:t>).</w:t>
+      </w:r>
+    </w:p>
+    <w:p>
+      <w:pPr>
+        <w:pStyle w:val="Prrafodelista"/>
+        <w:numPr>
+          <w:ilvl w:val="0"/>
+          <w:numId w:val="13"/>
+        </w:numPr>
+        <w:jc w:val="both"/>
+        <w:rPr>
+          <w:lang w:val="es-AR"/>
+        </w:rPr>
+      </w:pPr>
+      <w:proofErr w:type="spellStart"/>
+      <w:r>
+        <w:rPr>
+          <w:lang w:val="es-AR"/>
+        </w:rPr>
+        <w:t>Observer</w:t>
+      </w:r>
+      <w:proofErr w:type="spellEnd"/>
+      <w:r>
+        <w:rPr>
+          <w:lang w:val="es-AR"/>
+        </w:rPr>
+        <w:t>:</w:t>
+      </w:r>
+    </w:p>
+    <w:p>
+      <w:pPr>
+        <w:pStyle w:val="Prrafodelista"/>
+        <w:numPr>
+          <w:ilvl w:val="1"/>
+          <w:numId w:val="5"/>
+        </w:numPr>
+        <w:jc w:val="both"/>
+        <w:rPr>
+          <w:lang w:val="es-AR"/>
+        </w:rPr>
+      </w:pPr>
+      <w:r>
+        <w:rPr>
+          <w:lang w:val="es-AR"/>
+        </w:rPr>
+        <w:t>Utilizado en la notificación de autores sobre la revisión de sus artículos. En este patrón se debe tener u</w:t>
+      </w:r>
+      <w:r>
+        <w:rPr>
+          <w:lang w:val="es-AR"/>
+        </w:rPr>
+        <w:t>n sujeto observable (Articulo),</w:t>
+      </w:r>
+      <w:r>
+        <w:rPr>
+          <w:lang w:val="es-AR"/>
+        </w:rPr>
+        <w:t xml:space="preserve"> que mantiene una lista de observadores (_</w:t>
+      </w:r>
+      <w:proofErr w:type="spellStart"/>
+      <w:r>
+        <w:rPr>
+          <w:lang w:val="es-AR"/>
+        </w:rPr>
+        <w:t>autorNotificacion</w:t>
+      </w:r>
+      <w:proofErr w:type="spellEnd"/>
+      <w:proofErr w:type="gramStart"/>
+      <w:r>
+        <w:rPr>
+          <w:lang w:val="es-AR"/>
+        </w:rPr>
+        <w:t>),  un</w:t>
+      </w:r>
+      <w:proofErr w:type="gramEnd"/>
+      <w:r>
+        <w:rPr>
+          <w:lang w:val="es-AR"/>
+        </w:rPr>
+        <w:t xml:space="preserve"> observador (</w:t>
+      </w:r>
+      <w:r>
+        <w:rPr>
+          <w:lang w:val="es-AR"/>
+        </w:rPr>
+        <w:t xml:space="preserve">el </w:t>
+      </w:r>
+      <w:r>
+        <w:rPr>
+          <w:lang w:val="es-AR"/>
+        </w:rPr>
+        <w:t>Autor que es el que recibe la notificación) y un método de notificación (notificar(</w:t>
+      </w:r>
+      <w:proofErr w:type="spellStart"/>
+      <w:r>
+        <w:rPr>
+          <w:lang w:val="es-AR"/>
+        </w:rPr>
+        <w:t>msg</w:t>
+      </w:r>
+      <w:proofErr w:type="spellEnd"/>
+      <w:r>
+        <w:rPr>
+          <w:lang w:val="es-AR"/>
+        </w:rPr>
+        <w:t>) en artículo).</w:t>
+      </w:r>
+    </w:p>
+    <w:p>
+      <w:pPr>
+        <w:rPr>
+          <w:u w:val="single"/>
+          <w:lang w:val="es-AR"/>
+        </w:rPr>
+      </w:pPr>
+      <w:r>
+        <w:rPr>
+          <w:u w:val="single"/>
+          <w:lang w:val="es-AR"/>
+        </w:rPr>
+        <w:t>Pruebas y Cobertura</w:t>
+      </w:r>
+    </w:p>
+    <w:p>
+      <w:pPr>
+        <w:rPr>
+          <w:b/>
+          <w:sz w:val="28"/>
+          <w:szCs w:val="28"/>
+          <w:lang w:val="es-AR"/>
+        </w:rPr>
+      </w:pPr>
+      <w:r>
+        <w:rPr>
+          <w:lang w:val="es-AR"/>
+        </w:rPr>
+        <w:t xml:space="preserve">Para garantizar el correcto funcionamiento del sistema, se utilizaron </w:t>
+      </w:r>
+      <w:proofErr w:type="spellStart"/>
+      <w:r>
+        <w:rPr>
+          <w:lang w:val="es-AR"/>
+        </w:rPr>
+        <w:t>Fixtures</w:t>
+      </w:r>
+      <w:proofErr w:type="spellEnd"/>
+      <w:r>
+        <w:rPr>
+          <w:lang w:val="es-AR"/>
+        </w:rPr>
+        <w:t xml:space="preserve"> y </w:t>
+      </w:r>
+      <w:proofErr w:type="spellStart"/>
+      <w:r>
+        <w:rPr>
+          <w:lang w:val="es-AR"/>
+        </w:rPr>
+        <w:t>Tests</w:t>
+      </w:r>
+      <w:proofErr w:type="spellEnd"/>
+      <w:r>
+        <w:rPr>
+          <w:lang w:val="es-AR"/>
+        </w:rPr>
+        <w:t xml:space="preserve"> con </w:t>
+      </w:r>
+      <w:proofErr w:type="spellStart"/>
+      <w:r>
+        <w:rPr>
+          <w:lang w:val="es-AR"/>
+        </w:rPr>
+        <w:t>Jest</w:t>
+      </w:r>
+      <w:proofErr w:type="spellEnd"/>
+      <w:r>
+        <w:rPr>
+          <w:lang w:val="es-AR"/>
+        </w:rPr>
+        <w:t xml:space="preserve">, lo que permitió verificar la funcionalidad del sistema en distintos escenarios. Además, se agregó </w:t>
+      </w:r>
+      <w:proofErr w:type="spellStart"/>
+      <w:r>
+        <w:rPr>
+          <w:lang w:val="es-AR"/>
+        </w:rPr>
+        <w:t>Coverage</w:t>
+      </w:r>
+      <w:proofErr w:type="spellEnd"/>
+      <w:r>
+        <w:rPr>
+          <w:lang w:val="es-AR"/>
+        </w:rPr>
+        <w:t xml:space="preserve">, una herramienta que mide el porcentaje de cobertura de los </w:t>
+      </w:r>
+      <w:proofErr w:type="spellStart"/>
+      <w:r>
+        <w:rPr>
+          <w:lang w:val="es-AR"/>
+        </w:rPr>
+        <w:t>tests</w:t>
+      </w:r>
+      <w:proofErr w:type="spellEnd"/>
+      <w:r>
+        <w:rPr>
+          <w:lang w:val="es-AR"/>
+        </w:rPr>
+        <w:t>, asegurando que las pruebas abarcan una parte significativa del código y detectando posibles casos no contemplados.</w:t>
+      </w:r>
+      <w:bookmarkStart w:id="0" w:name="_GoBack"/>
+      <w:bookmarkEnd w:id="0"/>
     </w:p>
     <w:sectPr>
       <w:pgSz w:w="12240" w:h="15840"/>
@@ -69,8 +1765,1510 @@
 </w:document>
 </file>
 
+<file path=word/numbering.xml><?xml version="1.0" encoding="utf-8"?>
+<w:numbering xmlns:wpc="http://schemas.microsoft.com/office/word/2010/wordprocessingCanvas" xmlns:cx="http://schemas.microsoft.com/office/drawing/2014/chartex" xmlns:mc="http://schemas.openxmlformats.org/markup-compatibility/2006" xmlns:o="urn:schemas-microsoft-com:office:office" xmlns:r="http://schemas.openxmlformats.org/officeDocument/2006/relationships" xmlns:m="http://schemas.openxmlformats.org/officeDocument/2006/math" xmlns:v="urn:schemas-microsoft-com:vml" xmlns:wp14="http://schemas.microsoft.com/office/word/2010/wordprocessingDrawing" xmlns:wp="http://schemas.openxmlformats.org/drawingml/2006/wordprocessingDrawing" xmlns:w10="urn:schemas-microsoft-com:office:word" xmlns:w="http://schemas.openxmlformats.org/wordprocessingml/2006/main" xmlns:w14="http://schemas.microsoft.com/office/word/2010/wordml" xmlns:w15="http://schemas.microsoft.com/office/word/2012/wordml" xmlns:w16se="http://schemas.microsoft.com/office/word/2015/wordml/symex" xmlns:wpg="http://schemas.microsoft.com/office/word/2010/wordprocessingGroup" xmlns:wpi="http://schemas.microsoft.com/office/word/2010/wordprocessingInk" xmlns:wne="http://schemas.microsoft.com/office/word/2006/wordml" xmlns:wps="http://schemas.microsoft.com/office/word/2010/wordprocessingShape" mc:Ignorable="w14 w15 w16se wp14">
+  <w:abstractNum w:abstractNumId="0" w15:restartNumberingAfterBreak="0">
+    <w:nsid w:val="1B4A222D"/>
+    <w:multiLevelType w:val="hybridMultilevel"/>
+    <w:tmpl w:val="56265BFA"/>
+    <w:lvl w:ilvl="0" w:tplc="2C0A000F">
+      <w:start w:val="1"/>
+      <w:numFmt w:val="decimal"/>
+      <w:lvlText w:val="%1."/>
+      <w:lvlJc w:val="left"/>
+      <w:pPr>
+        <w:ind w:left="720" w:hanging="360"/>
+      </w:pPr>
+    </w:lvl>
+    <w:lvl w:ilvl="1" w:tplc="D26AB5FC">
+      <w:start w:val="2"/>
+      <w:numFmt w:val="bullet"/>
+      <w:lvlText w:val=""/>
+      <w:lvlJc w:val="left"/>
+      <w:pPr>
+        <w:ind w:left="1785" w:hanging="705"/>
+      </w:pPr>
+      <w:rPr>
+        <w:rFonts w:ascii="Symbol" w:eastAsiaTheme="minorHAnsi" w:hAnsi="Symbol" w:cstheme="minorBidi" w:hint="default"/>
+      </w:rPr>
+    </w:lvl>
+    <w:lvl w:ilvl="2" w:tplc="2C0A001B" w:tentative="1">
+      <w:start w:val="1"/>
+      <w:numFmt w:val="lowerRoman"/>
+      <w:lvlText w:val="%3."/>
+      <w:lvlJc w:val="right"/>
+      <w:pPr>
+        <w:ind w:left="2160" w:hanging="180"/>
+      </w:pPr>
+    </w:lvl>
+    <w:lvl w:ilvl="3" w:tplc="2C0A000F" w:tentative="1">
+      <w:start w:val="1"/>
+      <w:numFmt w:val="decimal"/>
+      <w:lvlText w:val="%4."/>
+      <w:lvlJc w:val="left"/>
+      <w:pPr>
+        <w:ind w:left="2880" w:hanging="360"/>
+      </w:pPr>
+    </w:lvl>
+    <w:lvl w:ilvl="4" w:tplc="2C0A0019" w:tentative="1">
+      <w:start w:val="1"/>
+      <w:numFmt w:val="lowerLetter"/>
+      <w:lvlText w:val="%5."/>
+      <w:lvlJc w:val="left"/>
+      <w:pPr>
+        <w:ind w:left="3600" w:hanging="360"/>
+      </w:pPr>
+    </w:lvl>
+    <w:lvl w:ilvl="5" w:tplc="2C0A001B" w:tentative="1">
+      <w:start w:val="1"/>
+      <w:numFmt w:val="lowerRoman"/>
+      <w:lvlText w:val="%6."/>
+      <w:lvlJc w:val="right"/>
+      <w:pPr>
+        <w:ind w:left="4320" w:hanging="180"/>
+      </w:pPr>
+    </w:lvl>
+    <w:lvl w:ilvl="6" w:tplc="2C0A000F" w:tentative="1">
+      <w:start w:val="1"/>
+      <w:numFmt w:val="decimal"/>
+      <w:lvlText w:val="%7."/>
+      <w:lvlJc w:val="left"/>
+      <w:pPr>
+        <w:ind w:left="5040" w:hanging="360"/>
+      </w:pPr>
+    </w:lvl>
+    <w:lvl w:ilvl="7" w:tplc="2C0A0019" w:tentative="1">
+      <w:start w:val="1"/>
+      <w:numFmt w:val="lowerLetter"/>
+      <w:lvlText w:val="%8."/>
+      <w:lvlJc w:val="left"/>
+      <w:pPr>
+        <w:ind w:left="5760" w:hanging="360"/>
+      </w:pPr>
+    </w:lvl>
+    <w:lvl w:ilvl="8" w:tplc="2C0A001B" w:tentative="1">
+      <w:start w:val="1"/>
+      <w:numFmt w:val="lowerRoman"/>
+      <w:lvlText w:val="%9."/>
+      <w:lvlJc w:val="right"/>
+      <w:pPr>
+        <w:ind w:left="6480" w:hanging="180"/>
+      </w:pPr>
+    </w:lvl>
+  </w:abstractNum>
+  <w:abstractNum w:abstractNumId="1" w15:restartNumberingAfterBreak="0">
+    <w:nsid w:val="22C053C4"/>
+    <w:multiLevelType w:val="hybridMultilevel"/>
+    <w:tmpl w:val="B426B31C"/>
+    <w:lvl w:ilvl="0" w:tplc="2C0A000F">
+      <w:start w:val="1"/>
+      <w:numFmt w:val="decimal"/>
+      <w:lvlText w:val="%1."/>
+      <w:lvlJc w:val="left"/>
+      <w:pPr>
+        <w:ind w:left="720" w:hanging="360"/>
+      </w:pPr>
+    </w:lvl>
+    <w:lvl w:ilvl="1" w:tplc="2C0A0019" w:tentative="1">
+      <w:start w:val="1"/>
+      <w:numFmt w:val="lowerLetter"/>
+      <w:lvlText w:val="%2."/>
+      <w:lvlJc w:val="left"/>
+      <w:pPr>
+        <w:ind w:left="1440" w:hanging="360"/>
+      </w:pPr>
+    </w:lvl>
+    <w:lvl w:ilvl="2" w:tplc="2C0A001B" w:tentative="1">
+      <w:start w:val="1"/>
+      <w:numFmt w:val="lowerRoman"/>
+      <w:lvlText w:val="%3."/>
+      <w:lvlJc w:val="right"/>
+      <w:pPr>
+        <w:ind w:left="2160" w:hanging="180"/>
+      </w:pPr>
+    </w:lvl>
+    <w:lvl w:ilvl="3" w:tplc="2C0A000F" w:tentative="1">
+      <w:start w:val="1"/>
+      <w:numFmt w:val="decimal"/>
+      <w:lvlText w:val="%4."/>
+      <w:lvlJc w:val="left"/>
+      <w:pPr>
+        <w:ind w:left="2880" w:hanging="360"/>
+      </w:pPr>
+    </w:lvl>
+    <w:lvl w:ilvl="4" w:tplc="2C0A0019" w:tentative="1">
+      <w:start w:val="1"/>
+      <w:numFmt w:val="lowerLetter"/>
+      <w:lvlText w:val="%5."/>
+      <w:lvlJc w:val="left"/>
+      <w:pPr>
+        <w:ind w:left="3600" w:hanging="360"/>
+      </w:pPr>
+    </w:lvl>
+    <w:lvl w:ilvl="5" w:tplc="2C0A001B" w:tentative="1">
+      <w:start w:val="1"/>
+      <w:numFmt w:val="lowerRoman"/>
+      <w:lvlText w:val="%6."/>
+      <w:lvlJc w:val="right"/>
+      <w:pPr>
+        <w:ind w:left="4320" w:hanging="180"/>
+      </w:pPr>
+    </w:lvl>
+    <w:lvl w:ilvl="6" w:tplc="2C0A000F" w:tentative="1">
+      <w:start w:val="1"/>
+      <w:numFmt w:val="decimal"/>
+      <w:lvlText w:val="%7."/>
+      <w:lvlJc w:val="left"/>
+      <w:pPr>
+        <w:ind w:left="5040" w:hanging="360"/>
+      </w:pPr>
+    </w:lvl>
+    <w:lvl w:ilvl="7" w:tplc="2C0A0019" w:tentative="1">
+      <w:start w:val="1"/>
+      <w:numFmt w:val="lowerLetter"/>
+      <w:lvlText w:val="%8."/>
+      <w:lvlJc w:val="left"/>
+      <w:pPr>
+        <w:ind w:left="5760" w:hanging="360"/>
+      </w:pPr>
+    </w:lvl>
+    <w:lvl w:ilvl="8" w:tplc="2C0A001B" w:tentative="1">
+      <w:start w:val="1"/>
+      <w:numFmt w:val="lowerRoman"/>
+      <w:lvlText w:val="%9."/>
+      <w:lvlJc w:val="right"/>
+      <w:pPr>
+        <w:ind w:left="6480" w:hanging="180"/>
+      </w:pPr>
+    </w:lvl>
+  </w:abstractNum>
+  <w:abstractNum w:abstractNumId="2" w15:restartNumberingAfterBreak="0">
+    <w:nsid w:val="30C939CC"/>
+    <w:multiLevelType w:val="hybridMultilevel"/>
+    <w:tmpl w:val="21E25FE8"/>
+    <w:lvl w:ilvl="0" w:tplc="2C0A0005">
+      <w:start w:val="1"/>
+      <w:numFmt w:val="bullet"/>
+      <w:lvlText w:val=""/>
+      <w:lvlJc w:val="left"/>
+      <w:pPr>
+        <w:ind w:left="1080" w:hanging="360"/>
+      </w:pPr>
+      <w:rPr>
+        <w:rFonts w:ascii="Wingdings" w:hAnsi="Wingdings" w:hint="default"/>
+      </w:rPr>
+    </w:lvl>
+    <w:lvl w:ilvl="1" w:tplc="2C0A0003" w:tentative="1">
+      <w:start w:val="1"/>
+      <w:numFmt w:val="bullet"/>
+      <w:lvlText w:val="o"/>
+      <w:lvlJc w:val="left"/>
+      <w:pPr>
+        <w:ind w:left="1800" w:hanging="360"/>
+      </w:pPr>
+      <w:rPr>
+        <w:rFonts w:ascii="Courier New" w:hAnsi="Courier New" w:cs="Courier New" w:hint="default"/>
+      </w:rPr>
+    </w:lvl>
+    <w:lvl w:ilvl="2" w:tplc="2C0A0005" w:tentative="1">
+      <w:start w:val="1"/>
+      <w:numFmt w:val="bullet"/>
+      <w:lvlText w:val=""/>
+      <w:lvlJc w:val="left"/>
+      <w:pPr>
+        <w:ind w:left="2520" w:hanging="360"/>
+      </w:pPr>
+      <w:rPr>
+        <w:rFonts w:ascii="Wingdings" w:hAnsi="Wingdings" w:hint="default"/>
+      </w:rPr>
+    </w:lvl>
+    <w:lvl w:ilvl="3" w:tplc="2C0A0001" w:tentative="1">
+      <w:start w:val="1"/>
+      <w:numFmt w:val="bullet"/>
+      <w:lvlText w:val=""/>
+      <w:lvlJc w:val="left"/>
+      <w:pPr>
+        <w:ind w:left="3240" w:hanging="360"/>
+      </w:pPr>
+      <w:rPr>
+        <w:rFonts w:ascii="Symbol" w:hAnsi="Symbol" w:hint="default"/>
+      </w:rPr>
+    </w:lvl>
+    <w:lvl w:ilvl="4" w:tplc="2C0A0003" w:tentative="1">
+      <w:start w:val="1"/>
+      <w:numFmt w:val="bullet"/>
+      <w:lvlText w:val="o"/>
+      <w:lvlJc w:val="left"/>
+      <w:pPr>
+        <w:ind w:left="3960" w:hanging="360"/>
+      </w:pPr>
+      <w:rPr>
+        <w:rFonts w:ascii="Courier New" w:hAnsi="Courier New" w:cs="Courier New" w:hint="default"/>
+      </w:rPr>
+    </w:lvl>
+    <w:lvl w:ilvl="5" w:tplc="2C0A0005" w:tentative="1">
+      <w:start w:val="1"/>
+      <w:numFmt w:val="bullet"/>
+      <w:lvlText w:val=""/>
+      <w:lvlJc w:val="left"/>
+      <w:pPr>
+        <w:ind w:left="4680" w:hanging="360"/>
+      </w:pPr>
+      <w:rPr>
+        <w:rFonts w:ascii="Wingdings" w:hAnsi="Wingdings" w:hint="default"/>
+      </w:rPr>
+    </w:lvl>
+    <w:lvl w:ilvl="6" w:tplc="2C0A0001" w:tentative="1">
+      <w:start w:val="1"/>
+      <w:numFmt w:val="bullet"/>
+      <w:lvlText w:val=""/>
+      <w:lvlJc w:val="left"/>
+      <w:pPr>
+        <w:ind w:left="5400" w:hanging="360"/>
+      </w:pPr>
+      <w:rPr>
+        <w:rFonts w:ascii="Symbol" w:hAnsi="Symbol" w:hint="default"/>
+      </w:rPr>
+    </w:lvl>
+    <w:lvl w:ilvl="7" w:tplc="2C0A0003" w:tentative="1">
+      <w:start w:val="1"/>
+      <w:numFmt w:val="bullet"/>
+      <w:lvlText w:val="o"/>
+      <w:lvlJc w:val="left"/>
+      <w:pPr>
+        <w:ind w:left="6120" w:hanging="360"/>
+      </w:pPr>
+      <w:rPr>
+        <w:rFonts w:ascii="Courier New" w:hAnsi="Courier New" w:cs="Courier New" w:hint="default"/>
+      </w:rPr>
+    </w:lvl>
+    <w:lvl w:ilvl="8" w:tplc="2C0A0005" w:tentative="1">
+      <w:start w:val="1"/>
+      <w:numFmt w:val="bullet"/>
+      <w:lvlText w:val=""/>
+      <w:lvlJc w:val="left"/>
+      <w:pPr>
+        <w:ind w:left="6840" w:hanging="360"/>
+      </w:pPr>
+      <w:rPr>
+        <w:rFonts w:ascii="Wingdings" w:hAnsi="Wingdings" w:hint="default"/>
+      </w:rPr>
+    </w:lvl>
+  </w:abstractNum>
+  <w:abstractNum w:abstractNumId="3" w15:restartNumberingAfterBreak="0">
+    <w:nsid w:val="357C0270"/>
+    <w:multiLevelType w:val="hybridMultilevel"/>
+    <w:tmpl w:val="6BBEF472"/>
+    <w:lvl w:ilvl="0" w:tplc="2C0A000B">
+      <w:start w:val="1"/>
+      <w:numFmt w:val="bullet"/>
+      <w:lvlText w:val=""/>
+      <w:lvlJc w:val="left"/>
+      <w:pPr>
+        <w:ind w:left="720" w:hanging="360"/>
+      </w:pPr>
+      <w:rPr>
+        <w:rFonts w:ascii="Wingdings" w:hAnsi="Wingdings" w:hint="default"/>
+      </w:rPr>
+    </w:lvl>
+    <w:lvl w:ilvl="1" w:tplc="2C0A0003" w:tentative="1">
+      <w:start w:val="1"/>
+      <w:numFmt w:val="bullet"/>
+      <w:lvlText w:val="o"/>
+      <w:lvlJc w:val="left"/>
+      <w:pPr>
+        <w:ind w:left="1440" w:hanging="360"/>
+      </w:pPr>
+      <w:rPr>
+        <w:rFonts w:ascii="Courier New" w:hAnsi="Courier New" w:cs="Courier New" w:hint="default"/>
+      </w:rPr>
+    </w:lvl>
+    <w:lvl w:ilvl="2" w:tplc="2C0A0005" w:tentative="1">
+      <w:start w:val="1"/>
+      <w:numFmt w:val="bullet"/>
+      <w:lvlText w:val=""/>
+      <w:lvlJc w:val="left"/>
+      <w:pPr>
+        <w:ind w:left="2160" w:hanging="360"/>
+      </w:pPr>
+      <w:rPr>
+        <w:rFonts w:ascii="Wingdings" w:hAnsi="Wingdings" w:hint="default"/>
+      </w:rPr>
+    </w:lvl>
+    <w:lvl w:ilvl="3" w:tplc="2C0A0001" w:tentative="1">
+      <w:start w:val="1"/>
+      <w:numFmt w:val="bullet"/>
+      <w:lvlText w:val=""/>
+      <w:lvlJc w:val="left"/>
+      <w:pPr>
+        <w:ind w:left="2880" w:hanging="360"/>
+      </w:pPr>
+      <w:rPr>
+        <w:rFonts w:ascii="Symbol" w:hAnsi="Symbol" w:hint="default"/>
+      </w:rPr>
+    </w:lvl>
+    <w:lvl w:ilvl="4" w:tplc="2C0A0003" w:tentative="1">
+      <w:start w:val="1"/>
+      <w:numFmt w:val="bullet"/>
+      <w:lvlText w:val="o"/>
+      <w:lvlJc w:val="left"/>
+      <w:pPr>
+        <w:ind w:left="3600" w:hanging="360"/>
+      </w:pPr>
+      <w:rPr>
+        <w:rFonts w:ascii="Courier New" w:hAnsi="Courier New" w:cs="Courier New" w:hint="default"/>
+      </w:rPr>
+    </w:lvl>
+    <w:lvl w:ilvl="5" w:tplc="2C0A0005" w:tentative="1">
+      <w:start w:val="1"/>
+      <w:numFmt w:val="bullet"/>
+      <w:lvlText w:val=""/>
+      <w:lvlJc w:val="left"/>
+      <w:pPr>
+        <w:ind w:left="4320" w:hanging="360"/>
+      </w:pPr>
+      <w:rPr>
+        <w:rFonts w:ascii="Wingdings" w:hAnsi="Wingdings" w:hint="default"/>
+      </w:rPr>
+    </w:lvl>
+    <w:lvl w:ilvl="6" w:tplc="2C0A0001" w:tentative="1">
+      <w:start w:val="1"/>
+      <w:numFmt w:val="bullet"/>
+      <w:lvlText w:val=""/>
+      <w:lvlJc w:val="left"/>
+      <w:pPr>
+        <w:ind w:left="5040" w:hanging="360"/>
+      </w:pPr>
+      <w:rPr>
+        <w:rFonts w:ascii="Symbol" w:hAnsi="Symbol" w:hint="default"/>
+      </w:rPr>
+    </w:lvl>
+    <w:lvl w:ilvl="7" w:tplc="2C0A0003" w:tentative="1">
+      <w:start w:val="1"/>
+      <w:numFmt w:val="bullet"/>
+      <w:lvlText w:val="o"/>
+      <w:lvlJc w:val="left"/>
+      <w:pPr>
+        <w:ind w:left="5760" w:hanging="360"/>
+      </w:pPr>
+      <w:rPr>
+        <w:rFonts w:ascii="Courier New" w:hAnsi="Courier New" w:cs="Courier New" w:hint="default"/>
+      </w:rPr>
+    </w:lvl>
+    <w:lvl w:ilvl="8" w:tplc="2C0A0005" w:tentative="1">
+      <w:start w:val="1"/>
+      <w:numFmt w:val="bullet"/>
+      <w:lvlText w:val=""/>
+      <w:lvlJc w:val="left"/>
+      <w:pPr>
+        <w:ind w:left="6480" w:hanging="360"/>
+      </w:pPr>
+      <w:rPr>
+        <w:rFonts w:ascii="Wingdings" w:hAnsi="Wingdings" w:hint="default"/>
+      </w:rPr>
+    </w:lvl>
+  </w:abstractNum>
+  <w:abstractNum w:abstractNumId="4" w15:restartNumberingAfterBreak="0">
+    <w:nsid w:val="3FD4575D"/>
+    <w:multiLevelType w:val="hybridMultilevel"/>
+    <w:tmpl w:val="BD643444"/>
+    <w:lvl w:ilvl="0" w:tplc="2C0A0005">
+      <w:start w:val="1"/>
+      <w:numFmt w:val="bullet"/>
+      <w:lvlText w:val=""/>
+      <w:lvlJc w:val="left"/>
+      <w:pPr>
+        <w:ind w:left="2130" w:hanging="360"/>
+      </w:pPr>
+      <w:rPr>
+        <w:rFonts w:ascii="Wingdings" w:hAnsi="Wingdings" w:hint="default"/>
+      </w:rPr>
+    </w:lvl>
+    <w:lvl w:ilvl="1" w:tplc="2C0A0003" w:tentative="1">
+      <w:start w:val="1"/>
+      <w:numFmt w:val="bullet"/>
+      <w:lvlText w:val="o"/>
+      <w:lvlJc w:val="left"/>
+      <w:pPr>
+        <w:ind w:left="2850" w:hanging="360"/>
+      </w:pPr>
+      <w:rPr>
+        <w:rFonts w:ascii="Courier New" w:hAnsi="Courier New" w:cs="Courier New" w:hint="default"/>
+      </w:rPr>
+    </w:lvl>
+    <w:lvl w:ilvl="2" w:tplc="2C0A0005" w:tentative="1">
+      <w:start w:val="1"/>
+      <w:numFmt w:val="bullet"/>
+      <w:lvlText w:val=""/>
+      <w:lvlJc w:val="left"/>
+      <w:pPr>
+        <w:ind w:left="3570" w:hanging="360"/>
+      </w:pPr>
+      <w:rPr>
+        <w:rFonts w:ascii="Wingdings" w:hAnsi="Wingdings" w:hint="default"/>
+      </w:rPr>
+    </w:lvl>
+    <w:lvl w:ilvl="3" w:tplc="2C0A0001" w:tentative="1">
+      <w:start w:val="1"/>
+      <w:numFmt w:val="bullet"/>
+      <w:lvlText w:val=""/>
+      <w:lvlJc w:val="left"/>
+      <w:pPr>
+        <w:ind w:left="4290" w:hanging="360"/>
+      </w:pPr>
+      <w:rPr>
+        <w:rFonts w:ascii="Symbol" w:hAnsi="Symbol" w:hint="default"/>
+      </w:rPr>
+    </w:lvl>
+    <w:lvl w:ilvl="4" w:tplc="2C0A0003" w:tentative="1">
+      <w:start w:val="1"/>
+      <w:numFmt w:val="bullet"/>
+      <w:lvlText w:val="o"/>
+      <w:lvlJc w:val="left"/>
+      <w:pPr>
+        <w:ind w:left="5010" w:hanging="360"/>
+      </w:pPr>
+      <w:rPr>
+        <w:rFonts w:ascii="Courier New" w:hAnsi="Courier New" w:cs="Courier New" w:hint="default"/>
+      </w:rPr>
+    </w:lvl>
+    <w:lvl w:ilvl="5" w:tplc="2C0A0005" w:tentative="1">
+      <w:start w:val="1"/>
+      <w:numFmt w:val="bullet"/>
+      <w:lvlText w:val=""/>
+      <w:lvlJc w:val="left"/>
+      <w:pPr>
+        <w:ind w:left="5730" w:hanging="360"/>
+      </w:pPr>
+      <w:rPr>
+        <w:rFonts w:ascii="Wingdings" w:hAnsi="Wingdings" w:hint="default"/>
+      </w:rPr>
+    </w:lvl>
+    <w:lvl w:ilvl="6" w:tplc="2C0A0001" w:tentative="1">
+      <w:start w:val="1"/>
+      <w:numFmt w:val="bullet"/>
+      <w:lvlText w:val=""/>
+      <w:lvlJc w:val="left"/>
+      <w:pPr>
+        <w:ind w:left="6450" w:hanging="360"/>
+      </w:pPr>
+      <w:rPr>
+        <w:rFonts w:ascii="Symbol" w:hAnsi="Symbol" w:hint="default"/>
+      </w:rPr>
+    </w:lvl>
+    <w:lvl w:ilvl="7" w:tplc="2C0A0003" w:tentative="1">
+      <w:start w:val="1"/>
+      <w:numFmt w:val="bullet"/>
+      <w:lvlText w:val="o"/>
+      <w:lvlJc w:val="left"/>
+      <w:pPr>
+        <w:ind w:left="7170" w:hanging="360"/>
+      </w:pPr>
+      <w:rPr>
+        <w:rFonts w:ascii="Courier New" w:hAnsi="Courier New" w:cs="Courier New" w:hint="default"/>
+      </w:rPr>
+    </w:lvl>
+    <w:lvl w:ilvl="8" w:tplc="2C0A0005" w:tentative="1">
+      <w:start w:val="1"/>
+      <w:numFmt w:val="bullet"/>
+      <w:lvlText w:val=""/>
+      <w:lvlJc w:val="left"/>
+      <w:pPr>
+        <w:ind w:left="7890" w:hanging="360"/>
+      </w:pPr>
+      <w:rPr>
+        <w:rFonts w:ascii="Wingdings" w:hAnsi="Wingdings" w:hint="default"/>
+      </w:rPr>
+    </w:lvl>
+  </w:abstractNum>
+  <w:abstractNum w:abstractNumId="5" w15:restartNumberingAfterBreak="0">
+    <w:nsid w:val="5BF0461A"/>
+    <w:multiLevelType w:val="multilevel"/>
+    <w:tmpl w:val="2586131C"/>
+    <w:lvl w:ilvl="0">
+      <w:start w:val="1"/>
+      <w:numFmt w:val="decimal"/>
+      <w:lvlText w:val="%1."/>
+      <w:lvlJc w:val="left"/>
+      <w:pPr>
+        <w:tabs>
+          <w:tab w:val="num" w:pos="720"/>
+        </w:tabs>
+        <w:ind w:left="720" w:hanging="360"/>
+      </w:pPr>
+    </w:lvl>
+    <w:lvl w:ilvl="1">
+      <w:start w:val="1"/>
+      <w:numFmt w:val="bullet"/>
+      <w:lvlText w:val="o"/>
+      <w:lvlJc w:val="left"/>
+      <w:pPr>
+        <w:tabs>
+          <w:tab w:val="num" w:pos="1440"/>
+        </w:tabs>
+        <w:ind w:left="1440" w:hanging="360"/>
+      </w:pPr>
+      <w:rPr>
+        <w:rFonts w:ascii="Courier New" w:hAnsi="Courier New" w:hint="default"/>
+        <w:sz w:val="20"/>
+      </w:rPr>
+    </w:lvl>
+    <w:lvl w:ilvl="2" w:tentative="1">
+      <w:start w:val="1"/>
+      <w:numFmt w:val="decimal"/>
+      <w:lvlText w:val="%3."/>
+      <w:lvlJc w:val="left"/>
+      <w:pPr>
+        <w:tabs>
+          <w:tab w:val="num" w:pos="2160"/>
+        </w:tabs>
+        <w:ind w:left="2160" w:hanging="360"/>
+      </w:pPr>
+    </w:lvl>
+    <w:lvl w:ilvl="3" w:tentative="1">
+      <w:start w:val="1"/>
+      <w:numFmt w:val="decimal"/>
+      <w:lvlText w:val="%4."/>
+      <w:lvlJc w:val="left"/>
+      <w:pPr>
+        <w:tabs>
+          <w:tab w:val="num" w:pos="2880"/>
+        </w:tabs>
+        <w:ind w:left="2880" w:hanging="360"/>
+      </w:pPr>
+    </w:lvl>
+    <w:lvl w:ilvl="4" w:tentative="1">
+      <w:start w:val="1"/>
+      <w:numFmt w:val="decimal"/>
+      <w:lvlText w:val="%5."/>
+      <w:lvlJc w:val="left"/>
+      <w:pPr>
+        <w:tabs>
+          <w:tab w:val="num" w:pos="3600"/>
+        </w:tabs>
+        <w:ind w:left="3600" w:hanging="360"/>
+      </w:pPr>
+    </w:lvl>
+    <w:lvl w:ilvl="5" w:tentative="1">
+      <w:start w:val="1"/>
+      <w:numFmt w:val="decimal"/>
+      <w:lvlText w:val="%6."/>
+      <w:lvlJc w:val="left"/>
+      <w:pPr>
+        <w:tabs>
+          <w:tab w:val="num" w:pos="4320"/>
+        </w:tabs>
+        <w:ind w:left="4320" w:hanging="360"/>
+      </w:pPr>
+    </w:lvl>
+    <w:lvl w:ilvl="6" w:tentative="1">
+      <w:start w:val="1"/>
+      <w:numFmt w:val="decimal"/>
+      <w:lvlText w:val="%7."/>
+      <w:lvlJc w:val="left"/>
+      <w:pPr>
+        <w:tabs>
+          <w:tab w:val="num" w:pos="5040"/>
+        </w:tabs>
+        <w:ind w:left="5040" w:hanging="360"/>
+      </w:pPr>
+    </w:lvl>
+    <w:lvl w:ilvl="7" w:tentative="1">
+      <w:start w:val="1"/>
+      <w:numFmt w:val="decimal"/>
+      <w:lvlText w:val="%8."/>
+      <w:lvlJc w:val="left"/>
+      <w:pPr>
+        <w:tabs>
+          <w:tab w:val="num" w:pos="5760"/>
+        </w:tabs>
+        <w:ind w:left="5760" w:hanging="360"/>
+      </w:pPr>
+    </w:lvl>
+    <w:lvl w:ilvl="8" w:tentative="1">
+      <w:start w:val="1"/>
+      <w:numFmt w:val="decimal"/>
+      <w:lvlText w:val="%9."/>
+      <w:lvlJc w:val="left"/>
+      <w:pPr>
+        <w:tabs>
+          <w:tab w:val="num" w:pos="6480"/>
+        </w:tabs>
+        <w:ind w:left="6480" w:hanging="360"/>
+      </w:pPr>
+    </w:lvl>
+  </w:abstractNum>
+  <w:abstractNum w:abstractNumId="6" w15:restartNumberingAfterBreak="0">
+    <w:nsid w:val="611957BD"/>
+    <w:multiLevelType w:val="multilevel"/>
+    <w:tmpl w:val="4872C142"/>
+    <w:lvl w:ilvl="0">
+      <w:start w:val="1"/>
+      <w:numFmt w:val="bullet"/>
+      <w:lvlText w:val=""/>
+      <w:lvlJc w:val="left"/>
+      <w:pPr>
+        <w:tabs>
+          <w:tab w:val="num" w:pos="720"/>
+        </w:tabs>
+        <w:ind w:left="720" w:hanging="360"/>
+      </w:pPr>
+      <w:rPr>
+        <w:rFonts w:ascii="Symbol" w:hAnsi="Symbol" w:hint="default"/>
+        <w:sz w:val="20"/>
+      </w:rPr>
+    </w:lvl>
+    <w:lvl w:ilvl="1" w:tentative="1">
+      <w:start w:val="1"/>
+      <w:numFmt w:val="bullet"/>
+      <w:lvlText w:val="o"/>
+      <w:lvlJc w:val="left"/>
+      <w:pPr>
+        <w:tabs>
+          <w:tab w:val="num" w:pos="1440"/>
+        </w:tabs>
+        <w:ind w:left="1440" w:hanging="360"/>
+      </w:pPr>
+      <w:rPr>
+        <w:rFonts w:ascii="Courier New" w:hAnsi="Courier New" w:hint="default"/>
+        <w:sz w:val="20"/>
+      </w:rPr>
+    </w:lvl>
+    <w:lvl w:ilvl="2" w:tentative="1">
+      <w:start w:val="1"/>
+      <w:numFmt w:val="bullet"/>
+      <w:lvlText w:val=""/>
+      <w:lvlJc w:val="left"/>
+      <w:pPr>
+        <w:tabs>
+          <w:tab w:val="num" w:pos="2160"/>
+        </w:tabs>
+        <w:ind w:left="2160" w:hanging="360"/>
+      </w:pPr>
+      <w:rPr>
+        <w:rFonts w:ascii="Wingdings" w:hAnsi="Wingdings" w:hint="default"/>
+        <w:sz w:val="20"/>
+      </w:rPr>
+    </w:lvl>
+    <w:lvl w:ilvl="3" w:tentative="1">
+      <w:start w:val="1"/>
+      <w:numFmt w:val="bullet"/>
+      <w:lvlText w:val=""/>
+      <w:lvlJc w:val="left"/>
+      <w:pPr>
+        <w:tabs>
+          <w:tab w:val="num" w:pos="2880"/>
+        </w:tabs>
+        <w:ind w:left="2880" w:hanging="360"/>
+      </w:pPr>
+      <w:rPr>
+        <w:rFonts w:ascii="Wingdings" w:hAnsi="Wingdings" w:hint="default"/>
+        <w:sz w:val="20"/>
+      </w:rPr>
+    </w:lvl>
+    <w:lvl w:ilvl="4" w:tentative="1">
+      <w:start w:val="1"/>
+      <w:numFmt w:val="bullet"/>
+      <w:lvlText w:val=""/>
+      <w:lvlJc w:val="left"/>
+      <w:pPr>
+        <w:tabs>
+          <w:tab w:val="num" w:pos="3600"/>
+        </w:tabs>
+        <w:ind w:left="3600" w:hanging="360"/>
+      </w:pPr>
+      <w:rPr>
+        <w:rFonts w:ascii="Wingdings" w:hAnsi="Wingdings" w:hint="default"/>
+        <w:sz w:val="20"/>
+      </w:rPr>
+    </w:lvl>
+    <w:lvl w:ilvl="5" w:tentative="1">
+      <w:start w:val="1"/>
+      <w:numFmt w:val="bullet"/>
+      <w:lvlText w:val=""/>
+      <w:lvlJc w:val="left"/>
+      <w:pPr>
+        <w:tabs>
+          <w:tab w:val="num" w:pos="4320"/>
+        </w:tabs>
+        <w:ind w:left="4320" w:hanging="360"/>
+      </w:pPr>
+      <w:rPr>
+        <w:rFonts w:ascii="Wingdings" w:hAnsi="Wingdings" w:hint="default"/>
+        <w:sz w:val="20"/>
+      </w:rPr>
+    </w:lvl>
+    <w:lvl w:ilvl="6" w:tentative="1">
+      <w:start w:val="1"/>
+      <w:numFmt w:val="bullet"/>
+      <w:lvlText w:val=""/>
+      <w:lvlJc w:val="left"/>
+      <w:pPr>
+        <w:tabs>
+          <w:tab w:val="num" w:pos="5040"/>
+        </w:tabs>
+        <w:ind w:left="5040" w:hanging="360"/>
+      </w:pPr>
+      <w:rPr>
+        <w:rFonts w:ascii="Wingdings" w:hAnsi="Wingdings" w:hint="default"/>
+        <w:sz w:val="20"/>
+      </w:rPr>
+    </w:lvl>
+    <w:lvl w:ilvl="7" w:tentative="1">
+      <w:start w:val="1"/>
+      <w:numFmt w:val="bullet"/>
+      <w:lvlText w:val=""/>
+      <w:lvlJc w:val="left"/>
+      <w:pPr>
+        <w:tabs>
+          <w:tab w:val="num" w:pos="5760"/>
+        </w:tabs>
+        <w:ind w:left="5760" w:hanging="360"/>
+      </w:pPr>
+      <w:rPr>
+        <w:rFonts w:ascii="Wingdings" w:hAnsi="Wingdings" w:hint="default"/>
+        <w:sz w:val="20"/>
+      </w:rPr>
+    </w:lvl>
+    <w:lvl w:ilvl="8" w:tentative="1">
+      <w:start w:val="1"/>
+      <w:numFmt w:val="bullet"/>
+      <w:lvlText w:val=""/>
+      <w:lvlJc w:val="left"/>
+      <w:pPr>
+        <w:tabs>
+          <w:tab w:val="num" w:pos="6480"/>
+        </w:tabs>
+        <w:ind w:left="6480" w:hanging="360"/>
+      </w:pPr>
+      <w:rPr>
+        <w:rFonts w:ascii="Wingdings" w:hAnsi="Wingdings" w:hint="default"/>
+        <w:sz w:val="20"/>
+      </w:rPr>
+    </w:lvl>
+  </w:abstractNum>
+  <w:abstractNum w:abstractNumId="7" w15:restartNumberingAfterBreak="0">
+    <w:nsid w:val="617A4C05"/>
+    <w:multiLevelType w:val="multilevel"/>
+    <w:tmpl w:val="4CD85CCE"/>
+    <w:lvl w:ilvl="0">
+      <w:start w:val="1"/>
+      <w:numFmt w:val="decimal"/>
+      <w:lvlText w:val="%1."/>
+      <w:lvlJc w:val="left"/>
+      <w:pPr>
+        <w:tabs>
+          <w:tab w:val="num" w:pos="720"/>
+        </w:tabs>
+        <w:ind w:left="720" w:hanging="360"/>
+      </w:pPr>
+    </w:lvl>
+    <w:lvl w:ilvl="1" w:tentative="1">
+      <w:start w:val="1"/>
+      <w:numFmt w:val="decimal"/>
+      <w:lvlText w:val="%2."/>
+      <w:lvlJc w:val="left"/>
+      <w:pPr>
+        <w:tabs>
+          <w:tab w:val="num" w:pos="1440"/>
+        </w:tabs>
+        <w:ind w:left="1440" w:hanging="360"/>
+      </w:pPr>
+    </w:lvl>
+    <w:lvl w:ilvl="2" w:tentative="1">
+      <w:start w:val="1"/>
+      <w:numFmt w:val="decimal"/>
+      <w:lvlText w:val="%3."/>
+      <w:lvlJc w:val="left"/>
+      <w:pPr>
+        <w:tabs>
+          <w:tab w:val="num" w:pos="2160"/>
+        </w:tabs>
+        <w:ind w:left="2160" w:hanging="360"/>
+      </w:pPr>
+    </w:lvl>
+    <w:lvl w:ilvl="3" w:tentative="1">
+      <w:start w:val="1"/>
+      <w:numFmt w:val="decimal"/>
+      <w:lvlText w:val="%4."/>
+      <w:lvlJc w:val="left"/>
+      <w:pPr>
+        <w:tabs>
+          <w:tab w:val="num" w:pos="2880"/>
+        </w:tabs>
+        <w:ind w:left="2880" w:hanging="360"/>
+      </w:pPr>
+    </w:lvl>
+    <w:lvl w:ilvl="4" w:tentative="1">
+      <w:start w:val="1"/>
+      <w:numFmt w:val="decimal"/>
+      <w:lvlText w:val="%5."/>
+      <w:lvlJc w:val="left"/>
+      <w:pPr>
+        <w:tabs>
+          <w:tab w:val="num" w:pos="3600"/>
+        </w:tabs>
+        <w:ind w:left="3600" w:hanging="360"/>
+      </w:pPr>
+    </w:lvl>
+    <w:lvl w:ilvl="5" w:tentative="1">
+      <w:start w:val="1"/>
+      <w:numFmt w:val="decimal"/>
+      <w:lvlText w:val="%6."/>
+      <w:lvlJc w:val="left"/>
+      <w:pPr>
+        <w:tabs>
+          <w:tab w:val="num" w:pos="4320"/>
+        </w:tabs>
+        <w:ind w:left="4320" w:hanging="360"/>
+      </w:pPr>
+    </w:lvl>
+    <w:lvl w:ilvl="6" w:tentative="1">
+      <w:start w:val="1"/>
+      <w:numFmt w:val="decimal"/>
+      <w:lvlText w:val="%7."/>
+      <w:lvlJc w:val="left"/>
+      <w:pPr>
+        <w:tabs>
+          <w:tab w:val="num" w:pos="5040"/>
+        </w:tabs>
+        <w:ind w:left="5040" w:hanging="360"/>
+      </w:pPr>
+    </w:lvl>
+    <w:lvl w:ilvl="7" w:tentative="1">
+      <w:start w:val="1"/>
+      <w:numFmt w:val="decimal"/>
+      <w:lvlText w:val="%8."/>
+      <w:lvlJc w:val="left"/>
+      <w:pPr>
+        <w:tabs>
+          <w:tab w:val="num" w:pos="5760"/>
+        </w:tabs>
+        <w:ind w:left="5760" w:hanging="360"/>
+      </w:pPr>
+    </w:lvl>
+    <w:lvl w:ilvl="8" w:tentative="1">
+      <w:start w:val="1"/>
+      <w:numFmt w:val="decimal"/>
+      <w:lvlText w:val="%9."/>
+      <w:lvlJc w:val="left"/>
+      <w:pPr>
+        <w:tabs>
+          <w:tab w:val="num" w:pos="6480"/>
+        </w:tabs>
+        <w:ind w:left="6480" w:hanging="360"/>
+      </w:pPr>
+    </w:lvl>
+  </w:abstractNum>
+  <w:abstractNum w:abstractNumId="8" w15:restartNumberingAfterBreak="0">
+    <w:nsid w:val="62274CE8"/>
+    <w:multiLevelType w:val="hybridMultilevel"/>
+    <w:tmpl w:val="5F468D5E"/>
+    <w:lvl w:ilvl="0" w:tplc="2C0A0005">
+      <w:start w:val="1"/>
+      <w:numFmt w:val="bullet"/>
+      <w:lvlText w:val=""/>
+      <w:lvlJc w:val="left"/>
+      <w:pPr>
+        <w:ind w:left="1440" w:hanging="360"/>
+      </w:pPr>
+      <w:rPr>
+        <w:rFonts w:ascii="Wingdings" w:hAnsi="Wingdings" w:hint="default"/>
+      </w:rPr>
+    </w:lvl>
+    <w:lvl w:ilvl="1" w:tplc="2C0A0003" w:tentative="1">
+      <w:start w:val="1"/>
+      <w:numFmt w:val="bullet"/>
+      <w:lvlText w:val="o"/>
+      <w:lvlJc w:val="left"/>
+      <w:pPr>
+        <w:ind w:left="2160" w:hanging="360"/>
+      </w:pPr>
+      <w:rPr>
+        <w:rFonts w:ascii="Courier New" w:hAnsi="Courier New" w:cs="Courier New" w:hint="default"/>
+      </w:rPr>
+    </w:lvl>
+    <w:lvl w:ilvl="2" w:tplc="2C0A0005" w:tentative="1">
+      <w:start w:val="1"/>
+      <w:numFmt w:val="bullet"/>
+      <w:lvlText w:val=""/>
+      <w:lvlJc w:val="left"/>
+      <w:pPr>
+        <w:ind w:left="2880" w:hanging="360"/>
+      </w:pPr>
+      <w:rPr>
+        <w:rFonts w:ascii="Wingdings" w:hAnsi="Wingdings" w:hint="default"/>
+      </w:rPr>
+    </w:lvl>
+    <w:lvl w:ilvl="3" w:tplc="2C0A0001" w:tentative="1">
+      <w:start w:val="1"/>
+      <w:numFmt w:val="bullet"/>
+      <w:lvlText w:val=""/>
+      <w:lvlJc w:val="left"/>
+      <w:pPr>
+        <w:ind w:left="3600" w:hanging="360"/>
+      </w:pPr>
+      <w:rPr>
+        <w:rFonts w:ascii="Symbol" w:hAnsi="Symbol" w:hint="default"/>
+      </w:rPr>
+    </w:lvl>
+    <w:lvl w:ilvl="4" w:tplc="2C0A0003" w:tentative="1">
+      <w:start w:val="1"/>
+      <w:numFmt w:val="bullet"/>
+      <w:lvlText w:val="o"/>
+      <w:lvlJc w:val="left"/>
+      <w:pPr>
+        <w:ind w:left="4320" w:hanging="360"/>
+      </w:pPr>
+      <w:rPr>
+        <w:rFonts w:ascii="Courier New" w:hAnsi="Courier New" w:cs="Courier New" w:hint="default"/>
+      </w:rPr>
+    </w:lvl>
+    <w:lvl w:ilvl="5" w:tplc="2C0A0005" w:tentative="1">
+      <w:start w:val="1"/>
+      <w:numFmt w:val="bullet"/>
+      <w:lvlText w:val=""/>
+      <w:lvlJc w:val="left"/>
+      <w:pPr>
+        <w:ind w:left="5040" w:hanging="360"/>
+      </w:pPr>
+      <w:rPr>
+        <w:rFonts w:ascii="Wingdings" w:hAnsi="Wingdings" w:hint="default"/>
+      </w:rPr>
+    </w:lvl>
+    <w:lvl w:ilvl="6" w:tplc="2C0A0001" w:tentative="1">
+      <w:start w:val="1"/>
+      <w:numFmt w:val="bullet"/>
+      <w:lvlText w:val=""/>
+      <w:lvlJc w:val="left"/>
+      <w:pPr>
+        <w:ind w:left="5760" w:hanging="360"/>
+      </w:pPr>
+      <w:rPr>
+        <w:rFonts w:ascii="Symbol" w:hAnsi="Symbol" w:hint="default"/>
+      </w:rPr>
+    </w:lvl>
+    <w:lvl w:ilvl="7" w:tplc="2C0A0003" w:tentative="1">
+      <w:start w:val="1"/>
+      <w:numFmt w:val="bullet"/>
+      <w:lvlText w:val="o"/>
+      <w:lvlJc w:val="left"/>
+      <w:pPr>
+        <w:ind w:left="6480" w:hanging="360"/>
+      </w:pPr>
+      <w:rPr>
+        <w:rFonts w:ascii="Courier New" w:hAnsi="Courier New" w:cs="Courier New" w:hint="default"/>
+      </w:rPr>
+    </w:lvl>
+    <w:lvl w:ilvl="8" w:tplc="2C0A0005" w:tentative="1">
+      <w:start w:val="1"/>
+      <w:numFmt w:val="bullet"/>
+      <w:lvlText w:val=""/>
+      <w:lvlJc w:val="left"/>
+      <w:pPr>
+        <w:ind w:left="7200" w:hanging="360"/>
+      </w:pPr>
+      <w:rPr>
+        <w:rFonts w:ascii="Wingdings" w:hAnsi="Wingdings" w:hint="default"/>
+      </w:rPr>
+    </w:lvl>
+  </w:abstractNum>
+  <w:abstractNum w:abstractNumId="9" w15:restartNumberingAfterBreak="0">
+    <w:nsid w:val="6BE73AA1"/>
+    <w:multiLevelType w:val="hybridMultilevel"/>
+    <w:tmpl w:val="E7B0D7FA"/>
+    <w:lvl w:ilvl="0" w:tplc="2C0A0005">
+      <w:start w:val="1"/>
+      <w:numFmt w:val="bullet"/>
+      <w:lvlText w:val=""/>
+      <w:lvlJc w:val="left"/>
+      <w:pPr>
+        <w:ind w:left="1440" w:hanging="360"/>
+      </w:pPr>
+      <w:rPr>
+        <w:rFonts w:ascii="Wingdings" w:hAnsi="Wingdings" w:hint="default"/>
+      </w:rPr>
+    </w:lvl>
+    <w:lvl w:ilvl="1" w:tplc="2C0A0003" w:tentative="1">
+      <w:start w:val="1"/>
+      <w:numFmt w:val="bullet"/>
+      <w:lvlText w:val="o"/>
+      <w:lvlJc w:val="left"/>
+      <w:pPr>
+        <w:ind w:left="2160" w:hanging="360"/>
+      </w:pPr>
+      <w:rPr>
+        <w:rFonts w:ascii="Courier New" w:hAnsi="Courier New" w:cs="Courier New" w:hint="default"/>
+      </w:rPr>
+    </w:lvl>
+    <w:lvl w:ilvl="2" w:tplc="2C0A0005" w:tentative="1">
+      <w:start w:val="1"/>
+      <w:numFmt w:val="bullet"/>
+      <w:lvlText w:val=""/>
+      <w:lvlJc w:val="left"/>
+      <w:pPr>
+        <w:ind w:left="2880" w:hanging="360"/>
+      </w:pPr>
+      <w:rPr>
+        <w:rFonts w:ascii="Wingdings" w:hAnsi="Wingdings" w:hint="default"/>
+      </w:rPr>
+    </w:lvl>
+    <w:lvl w:ilvl="3" w:tplc="2C0A0001" w:tentative="1">
+      <w:start w:val="1"/>
+      <w:numFmt w:val="bullet"/>
+      <w:lvlText w:val=""/>
+      <w:lvlJc w:val="left"/>
+      <w:pPr>
+        <w:ind w:left="3600" w:hanging="360"/>
+      </w:pPr>
+      <w:rPr>
+        <w:rFonts w:ascii="Symbol" w:hAnsi="Symbol" w:hint="default"/>
+      </w:rPr>
+    </w:lvl>
+    <w:lvl w:ilvl="4" w:tplc="2C0A0003" w:tentative="1">
+      <w:start w:val="1"/>
+      <w:numFmt w:val="bullet"/>
+      <w:lvlText w:val="o"/>
+      <w:lvlJc w:val="left"/>
+      <w:pPr>
+        <w:ind w:left="4320" w:hanging="360"/>
+      </w:pPr>
+      <w:rPr>
+        <w:rFonts w:ascii="Courier New" w:hAnsi="Courier New" w:cs="Courier New" w:hint="default"/>
+      </w:rPr>
+    </w:lvl>
+    <w:lvl w:ilvl="5" w:tplc="2C0A0005" w:tentative="1">
+      <w:start w:val="1"/>
+      <w:numFmt w:val="bullet"/>
+      <w:lvlText w:val=""/>
+      <w:lvlJc w:val="left"/>
+      <w:pPr>
+        <w:ind w:left="5040" w:hanging="360"/>
+      </w:pPr>
+      <w:rPr>
+        <w:rFonts w:ascii="Wingdings" w:hAnsi="Wingdings" w:hint="default"/>
+      </w:rPr>
+    </w:lvl>
+    <w:lvl w:ilvl="6" w:tplc="2C0A0001" w:tentative="1">
+      <w:start w:val="1"/>
+      <w:numFmt w:val="bullet"/>
+      <w:lvlText w:val=""/>
+      <w:lvlJc w:val="left"/>
+      <w:pPr>
+        <w:ind w:left="5760" w:hanging="360"/>
+      </w:pPr>
+      <w:rPr>
+        <w:rFonts w:ascii="Symbol" w:hAnsi="Symbol" w:hint="default"/>
+      </w:rPr>
+    </w:lvl>
+    <w:lvl w:ilvl="7" w:tplc="2C0A0003" w:tentative="1">
+      <w:start w:val="1"/>
+      <w:numFmt w:val="bullet"/>
+      <w:lvlText w:val="o"/>
+      <w:lvlJc w:val="left"/>
+      <w:pPr>
+        <w:ind w:left="6480" w:hanging="360"/>
+      </w:pPr>
+      <w:rPr>
+        <w:rFonts w:ascii="Courier New" w:hAnsi="Courier New" w:cs="Courier New" w:hint="default"/>
+      </w:rPr>
+    </w:lvl>
+    <w:lvl w:ilvl="8" w:tplc="2C0A0005" w:tentative="1">
+      <w:start w:val="1"/>
+      <w:numFmt w:val="bullet"/>
+      <w:lvlText w:val=""/>
+      <w:lvlJc w:val="left"/>
+      <w:pPr>
+        <w:ind w:left="7200" w:hanging="360"/>
+      </w:pPr>
+      <w:rPr>
+        <w:rFonts w:ascii="Wingdings" w:hAnsi="Wingdings" w:hint="default"/>
+      </w:rPr>
+    </w:lvl>
+  </w:abstractNum>
+  <w:abstractNum w:abstractNumId="10" w15:restartNumberingAfterBreak="0">
+    <w:nsid w:val="74E95C9C"/>
+    <w:multiLevelType w:val="hybridMultilevel"/>
+    <w:tmpl w:val="5002C470"/>
+    <w:lvl w:ilvl="0" w:tplc="2C0A000B">
+      <w:start w:val="1"/>
+      <w:numFmt w:val="bullet"/>
+      <w:lvlText w:val=""/>
+      <w:lvlJc w:val="left"/>
+      <w:pPr>
+        <w:ind w:left="720" w:hanging="360"/>
+      </w:pPr>
+      <w:rPr>
+        <w:rFonts w:ascii="Wingdings" w:hAnsi="Wingdings" w:hint="default"/>
+      </w:rPr>
+    </w:lvl>
+    <w:lvl w:ilvl="1" w:tplc="2C0A0003">
+      <w:start w:val="1"/>
+      <w:numFmt w:val="bullet"/>
+      <w:lvlText w:val="o"/>
+      <w:lvlJc w:val="left"/>
+      <w:pPr>
+        <w:ind w:left="1440" w:hanging="360"/>
+      </w:pPr>
+      <w:rPr>
+        <w:rFonts w:ascii="Courier New" w:hAnsi="Courier New" w:cs="Courier New" w:hint="default"/>
+      </w:rPr>
+    </w:lvl>
+    <w:lvl w:ilvl="2" w:tplc="2C0A0005" w:tentative="1">
+      <w:start w:val="1"/>
+      <w:numFmt w:val="bullet"/>
+      <w:lvlText w:val=""/>
+      <w:lvlJc w:val="left"/>
+      <w:pPr>
+        <w:ind w:left="2160" w:hanging="360"/>
+      </w:pPr>
+      <w:rPr>
+        <w:rFonts w:ascii="Wingdings" w:hAnsi="Wingdings" w:hint="default"/>
+      </w:rPr>
+    </w:lvl>
+    <w:lvl w:ilvl="3" w:tplc="2C0A0001" w:tentative="1">
+      <w:start w:val="1"/>
+      <w:numFmt w:val="bullet"/>
+      <w:lvlText w:val=""/>
+      <w:lvlJc w:val="left"/>
+      <w:pPr>
+        <w:ind w:left="2880" w:hanging="360"/>
+      </w:pPr>
+      <w:rPr>
+        <w:rFonts w:ascii="Symbol" w:hAnsi="Symbol" w:hint="default"/>
+      </w:rPr>
+    </w:lvl>
+    <w:lvl w:ilvl="4" w:tplc="2C0A0003" w:tentative="1">
+      <w:start w:val="1"/>
+      <w:numFmt w:val="bullet"/>
+      <w:lvlText w:val="o"/>
+      <w:lvlJc w:val="left"/>
+      <w:pPr>
+        <w:ind w:left="3600" w:hanging="360"/>
+      </w:pPr>
+      <w:rPr>
+        <w:rFonts w:ascii="Courier New" w:hAnsi="Courier New" w:cs="Courier New" w:hint="default"/>
+      </w:rPr>
+    </w:lvl>
+    <w:lvl w:ilvl="5" w:tplc="2C0A0005" w:tentative="1">
+      <w:start w:val="1"/>
+      <w:numFmt w:val="bullet"/>
+      <w:lvlText w:val=""/>
+      <w:lvlJc w:val="left"/>
+      <w:pPr>
+        <w:ind w:left="4320" w:hanging="360"/>
+      </w:pPr>
+      <w:rPr>
+        <w:rFonts w:ascii="Wingdings" w:hAnsi="Wingdings" w:hint="default"/>
+      </w:rPr>
+    </w:lvl>
+    <w:lvl w:ilvl="6" w:tplc="2C0A0001" w:tentative="1">
+      <w:start w:val="1"/>
+      <w:numFmt w:val="bullet"/>
+      <w:lvlText w:val=""/>
+      <w:lvlJc w:val="left"/>
+      <w:pPr>
+        <w:ind w:left="5040" w:hanging="360"/>
+      </w:pPr>
+      <w:rPr>
+        <w:rFonts w:ascii="Symbol" w:hAnsi="Symbol" w:hint="default"/>
+      </w:rPr>
+    </w:lvl>
+    <w:lvl w:ilvl="7" w:tplc="2C0A0003" w:tentative="1">
+      <w:start w:val="1"/>
+      <w:numFmt w:val="bullet"/>
+      <w:lvlText w:val="o"/>
+      <w:lvlJc w:val="left"/>
+      <w:pPr>
+        <w:ind w:left="5760" w:hanging="360"/>
+      </w:pPr>
+      <w:rPr>
+        <w:rFonts w:ascii="Courier New" w:hAnsi="Courier New" w:cs="Courier New" w:hint="default"/>
+      </w:rPr>
+    </w:lvl>
+    <w:lvl w:ilvl="8" w:tplc="2C0A0005" w:tentative="1">
+      <w:start w:val="1"/>
+      <w:numFmt w:val="bullet"/>
+      <w:lvlText w:val=""/>
+      <w:lvlJc w:val="left"/>
+      <w:pPr>
+        <w:ind w:left="6480" w:hanging="360"/>
+      </w:pPr>
+      <w:rPr>
+        <w:rFonts w:ascii="Wingdings" w:hAnsi="Wingdings" w:hint="default"/>
+      </w:rPr>
+    </w:lvl>
+  </w:abstractNum>
+  <w:abstractNum w:abstractNumId="11" w15:restartNumberingAfterBreak="0">
+    <w:nsid w:val="7AA71A15"/>
+    <w:multiLevelType w:val="hybridMultilevel"/>
+    <w:tmpl w:val="9886CC96"/>
+    <w:lvl w:ilvl="0" w:tplc="2C0A0005">
+      <w:start w:val="1"/>
+      <w:numFmt w:val="bullet"/>
+      <w:lvlText w:val=""/>
+      <w:lvlJc w:val="left"/>
+      <w:pPr>
+        <w:ind w:left="1440" w:hanging="360"/>
+      </w:pPr>
+      <w:rPr>
+        <w:rFonts w:ascii="Wingdings" w:hAnsi="Wingdings" w:hint="default"/>
+      </w:rPr>
+    </w:lvl>
+    <w:lvl w:ilvl="1" w:tplc="2C0A0003" w:tentative="1">
+      <w:start w:val="1"/>
+      <w:numFmt w:val="bullet"/>
+      <w:lvlText w:val="o"/>
+      <w:lvlJc w:val="left"/>
+      <w:pPr>
+        <w:ind w:left="2160" w:hanging="360"/>
+      </w:pPr>
+      <w:rPr>
+        <w:rFonts w:ascii="Courier New" w:hAnsi="Courier New" w:cs="Courier New" w:hint="default"/>
+      </w:rPr>
+    </w:lvl>
+    <w:lvl w:ilvl="2" w:tplc="2C0A0005" w:tentative="1">
+      <w:start w:val="1"/>
+      <w:numFmt w:val="bullet"/>
+      <w:lvlText w:val=""/>
+      <w:lvlJc w:val="left"/>
+      <w:pPr>
+        <w:ind w:left="2880" w:hanging="360"/>
+      </w:pPr>
+      <w:rPr>
+        <w:rFonts w:ascii="Wingdings" w:hAnsi="Wingdings" w:hint="default"/>
+      </w:rPr>
+    </w:lvl>
+    <w:lvl w:ilvl="3" w:tplc="2C0A0001" w:tentative="1">
+      <w:start w:val="1"/>
+      <w:numFmt w:val="bullet"/>
+      <w:lvlText w:val=""/>
+      <w:lvlJc w:val="left"/>
+      <w:pPr>
+        <w:ind w:left="3600" w:hanging="360"/>
+      </w:pPr>
+      <w:rPr>
+        <w:rFonts w:ascii="Symbol" w:hAnsi="Symbol" w:hint="default"/>
+      </w:rPr>
+    </w:lvl>
+    <w:lvl w:ilvl="4" w:tplc="2C0A0003" w:tentative="1">
+      <w:start w:val="1"/>
+      <w:numFmt w:val="bullet"/>
+      <w:lvlText w:val="o"/>
+      <w:lvlJc w:val="left"/>
+      <w:pPr>
+        <w:ind w:left="4320" w:hanging="360"/>
+      </w:pPr>
+      <w:rPr>
+        <w:rFonts w:ascii="Courier New" w:hAnsi="Courier New" w:cs="Courier New" w:hint="default"/>
+      </w:rPr>
+    </w:lvl>
+    <w:lvl w:ilvl="5" w:tplc="2C0A0005" w:tentative="1">
+      <w:start w:val="1"/>
+      <w:numFmt w:val="bullet"/>
+      <w:lvlText w:val=""/>
+      <w:lvlJc w:val="left"/>
+      <w:pPr>
+        <w:ind w:left="5040" w:hanging="360"/>
+      </w:pPr>
+      <w:rPr>
+        <w:rFonts w:ascii="Wingdings" w:hAnsi="Wingdings" w:hint="default"/>
+      </w:rPr>
+    </w:lvl>
+    <w:lvl w:ilvl="6" w:tplc="2C0A0001" w:tentative="1">
+      <w:start w:val="1"/>
+      <w:numFmt w:val="bullet"/>
+      <w:lvlText w:val=""/>
+      <w:lvlJc w:val="left"/>
+      <w:pPr>
+        <w:ind w:left="5760" w:hanging="360"/>
+      </w:pPr>
+      <w:rPr>
+        <w:rFonts w:ascii="Symbol" w:hAnsi="Symbol" w:hint="default"/>
+      </w:rPr>
+    </w:lvl>
+    <w:lvl w:ilvl="7" w:tplc="2C0A0003" w:tentative="1">
+      <w:start w:val="1"/>
+      <w:numFmt w:val="bullet"/>
+      <w:lvlText w:val="o"/>
+      <w:lvlJc w:val="left"/>
+      <w:pPr>
+        <w:ind w:left="6480" w:hanging="360"/>
+      </w:pPr>
+      <w:rPr>
+        <w:rFonts w:ascii="Courier New" w:hAnsi="Courier New" w:cs="Courier New" w:hint="default"/>
+      </w:rPr>
+    </w:lvl>
+    <w:lvl w:ilvl="8" w:tplc="2C0A0005" w:tentative="1">
+      <w:start w:val="1"/>
+      <w:numFmt w:val="bullet"/>
+      <w:lvlText w:val=""/>
+      <w:lvlJc w:val="left"/>
+      <w:pPr>
+        <w:ind w:left="7200" w:hanging="360"/>
+      </w:pPr>
+      <w:rPr>
+        <w:rFonts w:ascii="Wingdings" w:hAnsi="Wingdings" w:hint="default"/>
+      </w:rPr>
+    </w:lvl>
+  </w:abstractNum>
+  <w:abstractNum w:abstractNumId="12" w15:restartNumberingAfterBreak="0">
+    <w:nsid w:val="7CF80DFA"/>
+    <w:multiLevelType w:val="hybridMultilevel"/>
+    <w:tmpl w:val="C79C3860"/>
+    <w:lvl w:ilvl="0" w:tplc="2C0A0005">
+      <w:start w:val="1"/>
+      <w:numFmt w:val="bullet"/>
+      <w:lvlText w:val=""/>
+      <w:lvlJc w:val="left"/>
+      <w:pPr>
+        <w:ind w:left="1440" w:hanging="360"/>
+      </w:pPr>
+      <w:rPr>
+        <w:rFonts w:ascii="Wingdings" w:hAnsi="Wingdings" w:hint="default"/>
+      </w:rPr>
+    </w:lvl>
+    <w:lvl w:ilvl="1" w:tplc="2C0A0003" w:tentative="1">
+      <w:start w:val="1"/>
+      <w:numFmt w:val="bullet"/>
+      <w:lvlText w:val="o"/>
+      <w:lvlJc w:val="left"/>
+      <w:pPr>
+        <w:ind w:left="2160" w:hanging="360"/>
+      </w:pPr>
+      <w:rPr>
+        <w:rFonts w:ascii="Courier New" w:hAnsi="Courier New" w:cs="Courier New" w:hint="default"/>
+      </w:rPr>
+    </w:lvl>
+    <w:lvl w:ilvl="2" w:tplc="2C0A0005" w:tentative="1">
+      <w:start w:val="1"/>
+      <w:numFmt w:val="bullet"/>
+      <w:lvlText w:val=""/>
+      <w:lvlJc w:val="left"/>
+      <w:pPr>
+        <w:ind w:left="2880" w:hanging="360"/>
+      </w:pPr>
+      <w:rPr>
+        <w:rFonts w:ascii="Wingdings" w:hAnsi="Wingdings" w:hint="default"/>
+      </w:rPr>
+    </w:lvl>
+    <w:lvl w:ilvl="3" w:tplc="2C0A0001" w:tentative="1">
+      <w:start w:val="1"/>
+      <w:numFmt w:val="bullet"/>
+      <w:lvlText w:val=""/>
+      <w:lvlJc w:val="left"/>
+      <w:pPr>
+        <w:ind w:left="3600" w:hanging="360"/>
+      </w:pPr>
+      <w:rPr>
+        <w:rFonts w:ascii="Symbol" w:hAnsi="Symbol" w:hint="default"/>
+      </w:rPr>
+    </w:lvl>
+    <w:lvl w:ilvl="4" w:tplc="2C0A0003" w:tentative="1">
+      <w:start w:val="1"/>
+      <w:numFmt w:val="bullet"/>
+      <w:lvlText w:val="o"/>
+      <w:lvlJc w:val="left"/>
+      <w:pPr>
+        <w:ind w:left="4320" w:hanging="360"/>
+      </w:pPr>
+      <w:rPr>
+        <w:rFonts w:ascii="Courier New" w:hAnsi="Courier New" w:cs="Courier New" w:hint="default"/>
+      </w:rPr>
+    </w:lvl>
+    <w:lvl w:ilvl="5" w:tplc="2C0A0005" w:tentative="1">
+      <w:start w:val="1"/>
+      <w:numFmt w:val="bullet"/>
+      <w:lvlText w:val=""/>
+      <w:lvlJc w:val="left"/>
+      <w:pPr>
+        <w:ind w:left="5040" w:hanging="360"/>
+      </w:pPr>
+      <w:rPr>
+        <w:rFonts w:ascii="Wingdings" w:hAnsi="Wingdings" w:hint="default"/>
+      </w:rPr>
+    </w:lvl>
+    <w:lvl w:ilvl="6" w:tplc="2C0A0001" w:tentative="1">
+      <w:start w:val="1"/>
+      <w:numFmt w:val="bullet"/>
+      <w:lvlText w:val=""/>
+      <w:lvlJc w:val="left"/>
+      <w:pPr>
+        <w:ind w:left="5760" w:hanging="360"/>
+      </w:pPr>
+      <w:rPr>
+        <w:rFonts w:ascii="Symbol" w:hAnsi="Symbol" w:hint="default"/>
+      </w:rPr>
+    </w:lvl>
+    <w:lvl w:ilvl="7" w:tplc="2C0A0003" w:tentative="1">
+      <w:start w:val="1"/>
+      <w:numFmt w:val="bullet"/>
+      <w:lvlText w:val="o"/>
+      <w:lvlJc w:val="left"/>
+      <w:pPr>
+        <w:ind w:left="6480" w:hanging="360"/>
+      </w:pPr>
+      <w:rPr>
+        <w:rFonts w:ascii="Courier New" w:hAnsi="Courier New" w:cs="Courier New" w:hint="default"/>
+      </w:rPr>
+    </w:lvl>
+    <w:lvl w:ilvl="8" w:tplc="2C0A0005" w:tentative="1">
+      <w:start w:val="1"/>
+      <w:numFmt w:val="bullet"/>
+      <w:lvlText w:val=""/>
+      <w:lvlJc w:val="left"/>
+      <w:pPr>
+        <w:ind w:left="7200" w:hanging="360"/>
+      </w:pPr>
+      <w:rPr>
+        <w:rFonts w:ascii="Wingdings" w:hAnsi="Wingdings" w:hint="default"/>
+      </w:rPr>
+    </w:lvl>
+  </w:abstractNum>
+  <w:num w:numId="1">
+    <w:abstractNumId w:val="7"/>
+  </w:num>
+  <w:num w:numId="2">
+    <w:abstractNumId w:val="6"/>
+  </w:num>
+  <w:num w:numId="3">
+    <w:abstractNumId w:val="5"/>
+  </w:num>
+  <w:num w:numId="4">
+    <w:abstractNumId w:val="1"/>
+  </w:num>
+  <w:num w:numId="5">
+    <w:abstractNumId w:val="10"/>
+  </w:num>
+  <w:num w:numId="6">
+    <w:abstractNumId w:val="3"/>
+  </w:num>
+  <w:num w:numId="7">
+    <w:abstractNumId w:val="2"/>
+  </w:num>
+  <w:num w:numId="8">
+    <w:abstractNumId w:val="12"/>
+  </w:num>
+  <w:num w:numId="9">
+    <w:abstractNumId w:val="8"/>
+  </w:num>
+  <w:num w:numId="10">
+    <w:abstractNumId w:val="11"/>
+  </w:num>
+  <w:num w:numId="11">
+    <w:abstractNumId w:val="4"/>
+  </w:num>
+  <w:num w:numId="12">
+    <w:abstractNumId w:val="9"/>
+  </w:num>
+  <w:num w:numId="13">
+    <w:abstractNumId w:val="0"/>
+  </w:num>
+</w:numbering>
+</file>
+
 <file path=word/styles.xml><?xml version="1.0" encoding="utf-8"?>
-<w:styles xmlns:mc="http://schemas.openxmlformats.org/markup-compatibility/2006" xmlns:r="http://schemas.openxmlformats.org/officeDocument/2006/relationships" xmlns:w="http://schemas.openxmlformats.org/wordprocessingml/2006/main" xmlns:w14="http://schemas.microsoft.com/office/word/2010/wordml" xmlns:w15="http://schemas.microsoft.com/office/word/2012/wordml" xmlns:w16cex="http://schemas.microsoft.com/office/word/2018/wordml/cex" xmlns:w16cid="http://schemas.microsoft.com/office/word/2016/wordml/cid" xmlns:w16="http://schemas.microsoft.com/office/word/2018/wordml" xmlns:w16du="http://schemas.microsoft.com/office/word/2023/wordml/word16du" xmlns:w16sdtdh="http://schemas.microsoft.com/office/word/2020/wordml/sdtdatahash" xmlns:w16sdtfl="http://schemas.microsoft.com/office/word/2024/wordml/sdtformatlock" xmlns:w16se="http://schemas.microsoft.com/office/word/2015/wordml/symex" mc:Ignorable="w14 w15 w16se w16cid w16 w16cex w16sdtdh w16sdtfl w16du">
+<w:styles xmlns:mc="http://schemas.openxmlformats.org/markup-compatibility/2006" xmlns:r="http://schemas.openxmlformats.org/officeDocument/2006/relationships" xmlns:w="http://schemas.openxmlformats.org/wordprocessingml/2006/main" xmlns:w14="http://schemas.microsoft.com/office/word/2010/wordml" xmlns:w15="http://schemas.microsoft.com/office/word/2012/wordml" xmlns:w16se="http://schemas.microsoft.com/office/word/2015/wordml/symex" mc:Ignorable="w14 w15 w16se">
   <w:docDefaults>
     <w:rPrDefault>
       <w:rPr>
@@ -88,7 +3286,7 @@
       </w:pPr>
     </w:pPrDefault>
   </w:docDefaults>
-  <w:latentStyles w:defLockedState="0" w:defUIPriority="99" w:defSemiHidden="0" w:defUnhideWhenUsed="0" w:defQFormat="0" w:count="376">
+  <w:latentStyles w:defLockedState="0" w:defUIPriority="99" w:defSemiHidden="0" w:defUnhideWhenUsed="0" w:defQFormat="0" w:count="371">
     <w:lsdException w:name="Normal" w:uiPriority="0" w:qFormat="1"/>
     <w:lsdException w:name="heading 1" w:uiPriority="9" w:qFormat="1"/>
     <w:lsdException w:name="heading 2" w:semiHidden="1" w:uiPriority="9" w:unhideWhenUsed="1" w:qFormat="1"/>
@@ -460,11 +3658,6 @@
     <w:lsdException w:name="List Table 5 Dark Accent 6" w:uiPriority="50"/>
     <w:lsdException w:name="List Table 6 Colorful Accent 6" w:uiPriority="51"/>
     <w:lsdException w:name="List Table 7 Colorful Accent 6" w:uiPriority="52"/>
-    <w:lsdException w:name="Mention" w:semiHidden="1" w:unhideWhenUsed="1"/>
-    <w:lsdException w:name="Smart Hyperlink" w:semiHidden="1" w:unhideWhenUsed="1"/>
-    <w:lsdException w:name="Hashtag" w:semiHidden="1" w:unhideWhenUsed="1"/>
-    <w:lsdException w:name="Unresolved Mention" w:semiHidden="1" w:unhideWhenUsed="1"/>
-    <w:lsdException w:name="Smart Link" w:semiHidden="1" w:unhideWhenUsed="1"/>
   </w:latentStyles>
   <w:style w:type="paragraph" w:default="1" w:styleId="Normal">
     <w:name w:val="Normal"/>

</xml_diff>